<commit_message>
Corrigida imagem do diagrama de implantação no documento de arquitetura Issue#54
</commit_message>
<xml_diff>
--- a/AnaliseProjeto/Documento de Arquitetura.docx
+++ b/AnaliseProjeto/Documento de Arquitetura.docx
@@ -1,6 +1,6 @@
 
 <file path=word/document.xml><?xml version="1.0" encoding="utf-8"?>
-<w:document xmlns:wpc="http://schemas.microsoft.com/office/word/2010/wordprocessingCanvas" xmlns:cx="http://schemas.microsoft.com/office/drawing/2014/chartex" xmlns:cx1="http://schemas.microsoft.com/office/drawing/2015/9/8/chartex" xmlns:cx2="http://schemas.microsoft.com/office/drawing/2015/10/21/chartex" xmlns:cx3="http://schemas.microsoft.com/office/drawing/2016/5/9/chartex" xmlns:cx4="http://schemas.microsoft.com/office/drawing/2016/5/10/chartex" xmlns:cx5="http://schemas.microsoft.com/office/drawing/2016/5/11/chartex" xmlns:cx6="http://schemas.microsoft.com/office/drawing/2016/5/12/chartex" xmlns:cx7="http://schemas.microsoft.com/office/drawing/2016/5/13/chartex" xmlns:cx8="http://schemas.microsoft.com/office/drawing/2016/5/14/chartex" xmlns:mc="http://schemas.openxmlformats.org/markup-compatibility/2006" xmlns:aink="http://schemas.microsoft.com/office/drawing/2016/ink" xmlns:am3d="http://schemas.microsoft.com/office/drawing/2017/model3d" xmlns:o="urn:schemas-microsoft-com:office:office" xmlns:r="http://schemas.openxmlformats.org/officeDocument/2006/relationships" xmlns:m="http://schemas.openxmlformats.org/officeDocument/2006/math" xmlns:v="urn:schemas-microsoft-com:vml" xmlns:wp14="http://schemas.microsoft.com/office/word/2010/wordprocessingDrawing" xmlns:wp="http://schemas.openxmlformats.org/drawingml/2006/wordprocessingDrawing" xmlns:w10="urn:schemas-microsoft-com:office:word" xmlns:w="http://schemas.openxmlformats.org/wordprocessingml/2006/main" xmlns:w14="http://schemas.microsoft.com/office/word/2010/wordml" xmlns:w15="http://schemas.microsoft.com/office/word/2012/wordml" xmlns:w16cex="http://schemas.microsoft.com/office/word/2018/wordml/cex" xmlns:w16cid="http://schemas.microsoft.com/office/word/2016/wordml/cid" xmlns:w16="http://schemas.microsoft.com/office/word/2018/wordml" xmlns:w16sdtdh="http://schemas.microsoft.com/office/word/2020/wordml/sdtdatahash" xmlns:w16se="http://schemas.microsoft.com/office/word/2015/wordml/symex" xmlns:wpg="http://schemas.microsoft.com/office/word/2010/wordprocessingGroup" xmlns:wpi="http://schemas.microsoft.com/office/word/2010/wordprocessingInk" xmlns:wne="http://schemas.microsoft.com/office/word/2006/wordml" xmlns:wps="http://schemas.microsoft.com/office/word/2010/wordprocessingShape" mc:Ignorable="w14 w15 w16se w16cid w16 w16cex w16sdtdh wp14">
+<w:document xmlns:wpc="http://schemas.microsoft.com/office/word/2010/wordprocessingCanvas" xmlns:cx="http://schemas.microsoft.com/office/drawing/2014/chartex" xmlns:cx1="http://schemas.microsoft.com/office/drawing/2015/9/8/chartex" xmlns:cx2="http://schemas.microsoft.com/office/drawing/2015/10/21/chartex" xmlns:cx3="http://schemas.microsoft.com/office/drawing/2016/5/9/chartex" xmlns:cx4="http://schemas.microsoft.com/office/drawing/2016/5/10/chartex" xmlns:cx5="http://schemas.microsoft.com/office/drawing/2016/5/11/chartex" xmlns:cx6="http://schemas.microsoft.com/office/drawing/2016/5/12/chartex" xmlns:cx7="http://schemas.microsoft.com/office/drawing/2016/5/13/chartex" xmlns:cx8="http://schemas.microsoft.com/office/drawing/2016/5/14/chartex" xmlns:mc="http://schemas.openxmlformats.org/markup-compatibility/2006" xmlns:aink="http://schemas.microsoft.com/office/drawing/2016/ink" xmlns:am3d="http://schemas.microsoft.com/office/drawing/2017/model3d" xmlns:o="urn:schemas-microsoft-com:office:office" xmlns:r="http://schemas.openxmlformats.org/officeDocument/2006/relationships" xmlns:m="http://schemas.openxmlformats.org/officeDocument/2006/math" xmlns:v="urn:schemas-microsoft-com:vml" xmlns:wp14="http://schemas.microsoft.com/office/word/2010/wordprocessingDrawing" xmlns:wp="http://schemas.openxmlformats.org/drawingml/2006/wordprocessingDrawing" xmlns:w10="urn:schemas-microsoft-com:office:word" xmlns:w="http://schemas.openxmlformats.org/wordprocessingml/2006/main" xmlns:w14="http://schemas.microsoft.com/office/word/2010/wordml" xmlns:w15="http://schemas.microsoft.com/office/word/2012/wordml" xmlns:w16cex="http://schemas.microsoft.com/office/word/2018/wordml/cex" xmlns:w16cid="http://schemas.microsoft.com/office/word/2016/wordml/cid" xmlns:w16="http://schemas.microsoft.com/office/word/2018/wordml" xmlns:w16se="http://schemas.microsoft.com/office/word/2015/wordml/symex" xmlns:wpg="http://schemas.microsoft.com/office/word/2010/wordprocessingGroup" xmlns:wpi="http://schemas.microsoft.com/office/word/2010/wordprocessingInk" xmlns:wne="http://schemas.microsoft.com/office/word/2006/wordml" xmlns:wps="http://schemas.microsoft.com/office/word/2010/wordprocessingShape" mc:Ignorable="w14 w15 w16se w16cid w16 w16cex wp14">
   <w:body>
     <w:p>
       <w:pPr>
@@ -12,7 +12,6 @@
           <w:lang w:val="pt-BR"/>
         </w:rPr>
       </w:pPr>
-      <w:proofErr w:type="spellStart"/>
       <w:r>
         <w:rPr>
           <w:rFonts w:ascii="Times New Roman" w:hAnsi="Times New Roman"/>
@@ -20,7 +19,6 @@
         </w:rPr>
         <w:t>DeliFit</w:t>
       </w:r>
-      <w:proofErr w:type="spellEnd"/>
     </w:p>
     <w:p>
       <w:pPr>
@@ -2008,14 +2006,12 @@
         </w:rPr>
         <w:t xml:space="preserve">Esse documento provê uma visão de alto nível dos objetivos da arquitetura, dos estilos arquiteturais e componentes que foram selecionados para implementação das funcionalidades propostas pelos casos de usos levantados do </w:t>
       </w:r>
-      <w:proofErr w:type="spellStart"/>
       <w:r>
         <w:rPr>
           <w:color w:val="000000"/>
         </w:rPr>
         <w:t>DeliFit</w:t>
       </w:r>
-      <w:proofErr w:type="spellEnd"/>
       <w:r>
         <w:rPr>
           <w:color w:val="000000"/>
@@ -2067,7 +2063,6 @@
         </w:rPr>
         <w:t xml:space="preserve">Este documento oferece uma visão geral arquitetural do sistema </w:t>
       </w:r>
-      <w:proofErr w:type="spellStart"/>
       <w:r>
         <w:rPr>
           <w:sz w:val="24"/>
@@ -2075,7 +2070,6 @@
         </w:rPr>
         <w:t>DeliFit</w:t>
       </w:r>
-      <w:proofErr w:type="spellEnd"/>
       <w:r>
         <w:rPr>
           <w:sz w:val="24"/>
@@ -2128,7 +2122,6 @@
         </w:rPr>
         <w:t xml:space="preserve">Este Documento de Arquitetura de Software é aplicado ao Sistema </w:t>
       </w:r>
-      <w:proofErr w:type="spellStart"/>
       <w:r>
         <w:rPr>
           <w:sz w:val="24"/>
@@ -2136,7 +2129,6 @@
         </w:rPr>
         <w:t>DeliFit</w:t>
       </w:r>
-      <w:proofErr w:type="spellEnd"/>
       <w:r>
         <w:rPr>
           <w:sz w:val="24"/>
@@ -2149,23 +2141,7 @@
           <w:sz w:val="24"/>
           <w:szCs w:val="24"/>
         </w:rPr>
-        <w:t xml:space="preserve">Paulo Henrique, </w:t>
-      </w:r>
-      <w:proofErr w:type="spellStart"/>
-      <w:r>
-        <w:rPr>
-          <w:sz w:val="24"/>
-          <w:szCs w:val="24"/>
-        </w:rPr>
-        <w:t>Kauan</w:t>
-      </w:r>
-      <w:proofErr w:type="spellEnd"/>
-      <w:r>
-        <w:rPr>
-          <w:sz w:val="24"/>
-          <w:szCs w:val="24"/>
-        </w:rPr>
-        <w:t xml:space="preserve"> Felipe, Matheus Calixto e Leandro Carvalho</w:t>
+        <w:t>Paulo Henrique, Kauan Felipe, Matheus Calixto e Leandro Carvalho</w:t>
       </w:r>
       <w:r>
         <w:rPr>
@@ -2385,7 +2361,6 @@
           <w:lang w:val="pt-BR"/>
         </w:rPr>
       </w:pPr>
-      <w:proofErr w:type="spellStart"/>
       <w:r>
         <w:rPr>
           <w:i/>
@@ -2395,7 +2370,6 @@
         </w:rPr>
         <w:t>RationalUnifiedProcess</w:t>
       </w:r>
-      <w:proofErr w:type="spellEnd"/>
     </w:p>
     <w:p>
       <w:pPr>
@@ -2710,41 +2684,15 @@
           <w:sz w:val="24"/>
           <w:szCs w:val="24"/>
         </w:rPr>
-        <w:t xml:space="preserve">Este documento apresenta a arquitetura como uma série de visualizações, mencionadas acima. Essas visões são apresentadas como Modelos do </w:t>
-      </w:r>
-      <w:proofErr w:type="spellStart"/>
-      <w:r>
-        <w:rPr>
-          <w:sz w:val="24"/>
-          <w:szCs w:val="24"/>
-        </w:rPr>
-        <w:t>StarUML</w:t>
-      </w:r>
-      <w:proofErr w:type="spellEnd"/>
-      <w:r>
-        <w:rPr>
-          <w:sz w:val="24"/>
-          <w:szCs w:val="24"/>
-        </w:rPr>
-        <w:t xml:space="preserve"> e utiliza a Linguagem Unificada de Modelagem (UML – </w:t>
-      </w:r>
-      <w:proofErr w:type="spellStart"/>
+        <w:t xml:space="preserve">Este documento apresenta a arquitetura como uma série de visualizações, mencionadas acima. Essas visões são apresentadas como Modelos do StarUML e utiliza a Linguagem Unificada de Modelagem (UML – </w:t>
+      </w:r>
       <w:r>
         <w:rPr>
           <w:i/>
           <w:sz w:val="24"/>
           <w:szCs w:val="24"/>
         </w:rPr>
-        <w:t>UnifiedModelingLanguage</w:t>
-      </w:r>
-      <w:proofErr w:type="spellEnd"/>
-      <w:r>
-        <w:rPr>
-          <w:i/>
-          <w:sz w:val="24"/>
-          <w:szCs w:val="24"/>
-        </w:rPr>
-        <w:t>).</w:t>
+        <w:t>UnifiedModelingLanguage).</w:t>
       </w:r>
     </w:p>
     <w:p>
@@ -2865,7 +2813,6 @@
         </w:rPr>
         <w:t xml:space="preserve">A versão Mobile do </w:t>
       </w:r>
-      <w:proofErr w:type="spellStart"/>
       <w:r>
         <w:rPr>
           <w:sz w:val="24"/>
@@ -2873,7 +2820,6 @@
         </w:rPr>
         <w:t>DeliFit</w:t>
       </w:r>
-      <w:proofErr w:type="spellEnd"/>
       <w:r>
         <w:rPr>
           <w:sz w:val="24"/>
@@ -3791,7 +3737,6 @@
         </w:rPr>
         <w:t xml:space="preserve">A visão lógica do </w:t>
       </w:r>
-      <w:proofErr w:type="spellStart"/>
       <w:r>
         <w:rPr>
           <w:sz w:val="24"/>
@@ -3799,7 +3744,6 @@
         </w:rPr>
         <w:t>DeliFit</w:t>
       </w:r>
-      <w:proofErr w:type="spellEnd"/>
       <w:r>
         <w:rPr>
           <w:sz w:val="24"/>
@@ -3878,7 +3822,6 @@
           <w:lang w:val="pt-BR"/>
         </w:rPr>
       </w:pPr>
-      <w:proofErr w:type="spellStart"/>
       <w:r>
         <w:rPr>
           <w:iCs/>
@@ -3895,9 +3838,8 @@
           <w:szCs w:val="24"/>
           <w:lang w:val="pt-BR"/>
         </w:rPr>
-        <w:t>Web</w:t>
-      </w:r>
-      <w:proofErr w:type="spellEnd"/>
+        <w:t xml:space="preserve">Web: Nesses pacotes são armazenados os componentes que fazem parte da interface gráfica da aplicação, as Controladoras e as ViewModels do </w:t>
+      </w:r>
       <w:r>
         <w:rPr>
           <w:iCs/>
@@ -3905,39 +3847,8 @@
           <w:szCs w:val="24"/>
           <w:lang w:val="pt-BR"/>
         </w:rPr>
-        <w:t xml:space="preserve">: Nesses pacotes são armazenados os componentes que fazem parte da interface gráfica da aplicação, as Controladoras e as </w:t>
-      </w:r>
-      <w:proofErr w:type="spellStart"/>
-      <w:r>
-        <w:rPr>
-          <w:iCs/>
-          <w:sz w:val="24"/>
-          <w:szCs w:val="24"/>
-          <w:lang w:val="pt-BR"/>
-        </w:rPr>
-        <w:t>ViewModels</w:t>
-      </w:r>
-      <w:proofErr w:type="spellEnd"/>
-      <w:r>
-        <w:rPr>
-          <w:iCs/>
-          <w:sz w:val="24"/>
-          <w:szCs w:val="24"/>
-          <w:lang w:val="pt-BR"/>
-        </w:rPr>
-        <w:t xml:space="preserve"> do </w:t>
-      </w:r>
-      <w:proofErr w:type="spellStart"/>
-      <w:r>
-        <w:rPr>
-          <w:iCs/>
-          <w:sz w:val="24"/>
-          <w:szCs w:val="24"/>
-          <w:lang w:val="pt-BR"/>
-        </w:rPr>
         <w:t>DeliFit</w:t>
       </w:r>
-      <w:proofErr w:type="spellEnd"/>
       <w:r>
         <w:rPr>
           <w:iCs/>
@@ -4020,6 +3931,7 @@
       </w:pPr>
       <w:r>
         <w:rPr>
+          <w:noProof/>
           <w:sz w:val="24"/>
           <w:szCs w:val="24"/>
         </w:rPr>
@@ -4254,15 +4166,11 @@
         <w:jc w:val="center"/>
       </w:pPr>
       <w:r>
-        <w:rPr>
-          <w:noProof/>
-          <w:lang w:val="pt-BR" w:eastAsia="pt-BR"/>
-        </w:rPr>
         <w:drawing>
-          <wp:inline distT="0" distB="0" distL="0" distR="0" wp14:anchorId="5D61B039" wp14:editId="07B250A7">
-            <wp:extent cx="5496692" cy="5096586"/>
-            <wp:effectExtent l="0" t="0" r="8890" b="8890"/>
-            <wp:docPr id="7" name="Imagem 7"/>
+          <wp:inline distT="0" distB="0" distL="0" distR="0" wp14:anchorId="3BC3B10C" wp14:editId="5D6BF06D">
+            <wp:extent cx="4344006" cy="3982006"/>
+            <wp:effectExtent l="0" t="0" r="0" b="0"/>
+            <wp:docPr id="2" name="Imagem 2"/>
             <wp:cNvGraphicFramePr>
               <a:graphicFrameLocks xmlns:a="http://schemas.openxmlformats.org/drawingml/2006/main" noChangeAspect="1"/>
             </wp:cNvGraphicFramePr>
@@ -4282,7 +4190,7 @@
                   <pic:spPr>
                     <a:xfrm>
                       <a:off x="0" y="0"/>
-                      <a:ext cx="5496692" cy="5096586"/>
+                      <a:ext cx="4344006" cy="3982006"/>
                     </a:xfrm>
                     <a:prstGeom prst="rect">
                       <a:avLst/>
@@ -4294,6 +4202,8 @@
           </wp:inline>
         </w:drawing>
       </w:r>
+      <w:bookmarkStart w:id="35" w:name="_GoBack"/>
+      <w:bookmarkEnd w:id="35"/>
     </w:p>
     <w:p>
       <w:pPr>
@@ -4403,15 +4313,16 @@
         <w:ind w:left="360" w:hanging="360"/>
         <w:jc w:val="both"/>
       </w:pPr>
-      <w:bookmarkStart w:id="35" w:name="_Toc216458504"/>
+      <w:bookmarkStart w:id="36" w:name="_Toc216458504"/>
       <w:r>
         <w:rPr>
           <w:rFonts w:ascii="Times New Roman" w:hAnsi="Times New Roman"/>
           <w:lang w:val="pt-BR"/>
         </w:rPr>
+        <w:lastRenderedPageBreak/>
         <w:t>Visão de Implementação</w:t>
       </w:r>
-      <w:bookmarkEnd w:id="35"/>
+      <w:bookmarkEnd w:id="36"/>
     </w:p>
     <w:p>
       <w:pPr>
@@ -4517,8 +4428,8 @@
         <w:ind w:left="360" w:hanging="360"/>
         <w:jc w:val="both"/>
       </w:pPr>
-      <w:bookmarkStart w:id="36" w:name="_Toc18206193"/>
       <w:bookmarkStart w:id="37" w:name="_Toc216458505"/>
+      <w:bookmarkStart w:id="38" w:name="_Toc18206193"/>
       <w:r>
         <w:rPr>
           <w:rFonts w:ascii="Times New Roman" w:hAnsi="Times New Roman"/>
@@ -4535,7 +4446,7 @@
         </w:rPr>
         <w:t xml:space="preserve"> </w:t>
       </w:r>
-      <w:bookmarkEnd w:id="36"/>
+      <w:bookmarkEnd w:id="38"/>
     </w:p>
     <w:p>
       <w:pPr>
@@ -4550,6 +4461,7 @@
       </w:pPr>
       <w:r>
         <w:rPr>
+          <w:noProof/>
           <w:sz w:val="24"/>
           <w:szCs w:val="24"/>
           <w:lang w:val="pt-BR"/>
@@ -4635,8 +4547,8 @@
           <w:lang w:val="pt-BR"/>
         </w:rPr>
       </w:pPr>
-      <w:bookmarkStart w:id="38" w:name="_Toc18206194"/>
-      <w:bookmarkStart w:id="39" w:name="_Toc216458506"/>
+      <w:bookmarkStart w:id="39" w:name="_Toc18206194"/>
+      <w:bookmarkStart w:id="40" w:name="_Toc216458506"/>
       <w:r>
         <w:rPr>
           <w:rFonts w:ascii="Times New Roman" w:hAnsi="Times New Roman"/>
@@ -4644,7 +4556,7 @@
         </w:rPr>
         <w:t xml:space="preserve">Tamanho e </w:t>
       </w:r>
-      <w:bookmarkEnd w:id="38"/>
+      <w:bookmarkEnd w:id="39"/>
       <w:r>
         <w:rPr>
           <w:rFonts w:ascii="Times New Roman" w:hAnsi="Times New Roman"/>
@@ -4652,7 +4564,7 @@
         </w:rPr>
         <w:t>Performance</w:t>
       </w:r>
-      <w:bookmarkEnd w:id="39"/>
+      <w:bookmarkEnd w:id="40"/>
     </w:p>
     <w:p>
       <w:pPr>
@@ -4681,8 +4593,8 @@
           <w:lang w:val="pt-BR"/>
         </w:rPr>
       </w:pPr>
-      <w:bookmarkStart w:id="40" w:name="_Toc18206195"/>
-      <w:bookmarkStart w:id="41" w:name="_Toc216458507"/>
+      <w:bookmarkStart w:id="41" w:name="_Toc18206195"/>
+      <w:bookmarkStart w:id="42" w:name="_Toc216458507"/>
       <w:r>
         <w:rPr>
           <w:rFonts w:ascii="Times New Roman" w:hAnsi="Times New Roman"/>
@@ -4690,8 +4602,8 @@
         </w:rPr>
         <w:t>Qualidade</w:t>
       </w:r>
-      <w:bookmarkEnd w:id="40"/>
       <w:bookmarkEnd w:id="41"/>
+      <w:bookmarkEnd w:id="42"/>
     </w:p>
     <w:p>
       <w:pPr>
@@ -4720,7 +4632,7 @@
           <w:lang w:val="pt-BR"/>
         </w:rPr>
       </w:pPr>
-      <w:bookmarkStart w:id="42" w:name="_Toc216458508"/>
+      <w:bookmarkStart w:id="43" w:name="_Toc216458508"/>
       <w:r>
         <w:rPr>
           <w:rFonts w:ascii="Times New Roman" w:hAnsi="Times New Roman"/>
@@ -4729,7 +4641,7 @@
         <w:lastRenderedPageBreak/>
         <w:t>Exceções</w:t>
       </w:r>
-      <w:bookmarkEnd w:id="42"/>
+      <w:bookmarkEnd w:id="43"/>
     </w:p>
     <w:p>
       <w:pPr>
@@ -4794,23 +4706,7 @@
           <w:szCs w:val="24"/>
           <w:lang w:val="pt-BR"/>
         </w:rPr>
-        <w:t xml:space="preserve">Figura </w:t>
-      </w:r>
-      <w:r>
-        <w:rPr>
-          <w:sz w:val="24"/>
-          <w:szCs w:val="24"/>
-          <w:lang w:val="pt-BR"/>
-        </w:rPr>
-        <w:t>6</w:t>
-      </w:r>
-      <w:r>
-        <w:rPr>
-          <w:sz w:val="24"/>
-          <w:szCs w:val="24"/>
-          <w:lang w:val="pt-BR"/>
-        </w:rPr>
-        <w:t xml:space="preserve"> – Arquitetura de Exceções</w:t>
+        <w:t>Figura 6 – Arquitetura de Exceções</w:t>
       </w:r>
     </w:p>
     <w:p>
@@ -5098,7 +4994,7 @@
 </file>
 
 <file path=word/endnotes.xml><?xml version="1.0" encoding="utf-8"?>
-<w:endnotes xmlns:wpc="http://schemas.microsoft.com/office/word/2010/wordprocessingCanvas" xmlns:cx="http://schemas.microsoft.com/office/drawing/2014/chartex" xmlns:cx1="http://schemas.microsoft.com/office/drawing/2015/9/8/chartex" xmlns:cx2="http://schemas.microsoft.com/office/drawing/2015/10/21/chartex" xmlns:cx3="http://schemas.microsoft.com/office/drawing/2016/5/9/chartex" xmlns:cx4="http://schemas.microsoft.com/office/drawing/2016/5/10/chartex" xmlns:cx5="http://schemas.microsoft.com/office/drawing/2016/5/11/chartex" xmlns:cx6="http://schemas.microsoft.com/office/drawing/2016/5/12/chartex" xmlns:cx7="http://schemas.microsoft.com/office/drawing/2016/5/13/chartex" xmlns:cx8="http://schemas.microsoft.com/office/drawing/2016/5/14/chartex" xmlns:mc="http://schemas.openxmlformats.org/markup-compatibility/2006" xmlns:aink="http://schemas.microsoft.com/office/drawing/2016/ink" xmlns:am3d="http://schemas.microsoft.com/office/drawing/2017/model3d" xmlns:o="urn:schemas-microsoft-com:office:office" xmlns:r="http://schemas.openxmlformats.org/officeDocument/2006/relationships" xmlns:m="http://schemas.openxmlformats.org/officeDocument/2006/math" xmlns:v="urn:schemas-microsoft-com:vml" xmlns:wp14="http://schemas.microsoft.com/office/word/2010/wordprocessingDrawing" xmlns:wp="http://schemas.openxmlformats.org/drawingml/2006/wordprocessingDrawing" xmlns:w10="urn:schemas-microsoft-com:office:word" xmlns:w="http://schemas.openxmlformats.org/wordprocessingml/2006/main" xmlns:w14="http://schemas.microsoft.com/office/word/2010/wordml" xmlns:w15="http://schemas.microsoft.com/office/word/2012/wordml" xmlns:w16cex="http://schemas.microsoft.com/office/word/2018/wordml/cex" xmlns:w16cid="http://schemas.microsoft.com/office/word/2016/wordml/cid" xmlns:w16="http://schemas.microsoft.com/office/word/2018/wordml" xmlns:w16sdtdh="http://schemas.microsoft.com/office/word/2020/wordml/sdtdatahash" xmlns:w16se="http://schemas.microsoft.com/office/word/2015/wordml/symex" xmlns:wpg="http://schemas.microsoft.com/office/word/2010/wordprocessingGroup" xmlns:wpi="http://schemas.microsoft.com/office/word/2010/wordprocessingInk" xmlns:wne="http://schemas.microsoft.com/office/word/2006/wordml" xmlns:wps="http://schemas.microsoft.com/office/word/2010/wordprocessingShape" mc:Ignorable="w14 w15 w16se w16cid w16 w16cex w16sdtdh wp14">
+<w:endnotes xmlns:wpc="http://schemas.microsoft.com/office/word/2010/wordprocessingCanvas" xmlns:cx="http://schemas.microsoft.com/office/drawing/2014/chartex" xmlns:cx1="http://schemas.microsoft.com/office/drawing/2015/9/8/chartex" xmlns:cx2="http://schemas.microsoft.com/office/drawing/2015/10/21/chartex" xmlns:cx3="http://schemas.microsoft.com/office/drawing/2016/5/9/chartex" xmlns:cx4="http://schemas.microsoft.com/office/drawing/2016/5/10/chartex" xmlns:cx5="http://schemas.microsoft.com/office/drawing/2016/5/11/chartex" xmlns:cx6="http://schemas.microsoft.com/office/drawing/2016/5/12/chartex" xmlns:cx7="http://schemas.microsoft.com/office/drawing/2016/5/13/chartex" xmlns:cx8="http://schemas.microsoft.com/office/drawing/2016/5/14/chartex" xmlns:mc="http://schemas.openxmlformats.org/markup-compatibility/2006" xmlns:aink="http://schemas.microsoft.com/office/drawing/2016/ink" xmlns:am3d="http://schemas.microsoft.com/office/drawing/2017/model3d" xmlns:o="urn:schemas-microsoft-com:office:office" xmlns:r="http://schemas.openxmlformats.org/officeDocument/2006/relationships" xmlns:m="http://schemas.openxmlformats.org/officeDocument/2006/math" xmlns:v="urn:schemas-microsoft-com:vml" xmlns:wp14="http://schemas.microsoft.com/office/word/2010/wordprocessingDrawing" xmlns:wp="http://schemas.openxmlformats.org/drawingml/2006/wordprocessingDrawing" xmlns:w10="urn:schemas-microsoft-com:office:word" xmlns:w="http://schemas.openxmlformats.org/wordprocessingml/2006/main" xmlns:w14="http://schemas.microsoft.com/office/word/2010/wordml" xmlns:w15="http://schemas.microsoft.com/office/word/2012/wordml" xmlns:w16cex="http://schemas.microsoft.com/office/word/2018/wordml/cex" xmlns:w16cid="http://schemas.microsoft.com/office/word/2016/wordml/cid" xmlns:w16="http://schemas.microsoft.com/office/word/2018/wordml" xmlns:w16se="http://schemas.microsoft.com/office/word/2015/wordml/symex" xmlns:wpg="http://schemas.microsoft.com/office/word/2010/wordprocessingGroup" xmlns:wpi="http://schemas.microsoft.com/office/word/2010/wordprocessingInk" xmlns:wne="http://schemas.microsoft.com/office/word/2006/wordml" xmlns:wps="http://schemas.microsoft.com/office/word/2010/wordprocessingShape" mc:Ignorable="w14 w15 w16se w16cid w16 w16cex wp14">
   <w:endnote w:type="separator" w:id="-1">
     <w:p>
       <w:pPr>
@@ -5123,7 +5019,7 @@
 </file>
 
 <file path=word/footer1.xml><?xml version="1.0" encoding="utf-8"?>
-<w:ftr xmlns:wpc="http://schemas.microsoft.com/office/word/2010/wordprocessingCanvas" xmlns:cx="http://schemas.microsoft.com/office/drawing/2014/chartex" xmlns:cx1="http://schemas.microsoft.com/office/drawing/2015/9/8/chartex" xmlns:cx2="http://schemas.microsoft.com/office/drawing/2015/10/21/chartex" xmlns:cx3="http://schemas.microsoft.com/office/drawing/2016/5/9/chartex" xmlns:cx4="http://schemas.microsoft.com/office/drawing/2016/5/10/chartex" xmlns:cx5="http://schemas.microsoft.com/office/drawing/2016/5/11/chartex" xmlns:cx6="http://schemas.microsoft.com/office/drawing/2016/5/12/chartex" xmlns:cx7="http://schemas.microsoft.com/office/drawing/2016/5/13/chartex" xmlns:cx8="http://schemas.microsoft.com/office/drawing/2016/5/14/chartex" xmlns:mc="http://schemas.openxmlformats.org/markup-compatibility/2006" xmlns:aink="http://schemas.microsoft.com/office/drawing/2016/ink" xmlns:am3d="http://schemas.microsoft.com/office/drawing/2017/model3d" xmlns:o="urn:schemas-microsoft-com:office:office" xmlns:r="http://schemas.openxmlformats.org/officeDocument/2006/relationships" xmlns:m="http://schemas.openxmlformats.org/officeDocument/2006/math" xmlns:v="urn:schemas-microsoft-com:vml" xmlns:wp14="http://schemas.microsoft.com/office/word/2010/wordprocessingDrawing" xmlns:wp="http://schemas.openxmlformats.org/drawingml/2006/wordprocessingDrawing" xmlns:w10="urn:schemas-microsoft-com:office:word" xmlns:w="http://schemas.openxmlformats.org/wordprocessingml/2006/main" xmlns:w14="http://schemas.microsoft.com/office/word/2010/wordml" xmlns:w15="http://schemas.microsoft.com/office/word/2012/wordml" xmlns:w16cex="http://schemas.microsoft.com/office/word/2018/wordml/cex" xmlns:w16cid="http://schemas.microsoft.com/office/word/2016/wordml/cid" xmlns:w16="http://schemas.microsoft.com/office/word/2018/wordml" xmlns:w16sdtdh="http://schemas.microsoft.com/office/word/2020/wordml/sdtdatahash" xmlns:w16se="http://schemas.microsoft.com/office/word/2015/wordml/symex" xmlns:wpg="http://schemas.microsoft.com/office/word/2010/wordprocessingGroup" xmlns:wpi="http://schemas.microsoft.com/office/word/2010/wordprocessingInk" xmlns:wne="http://schemas.microsoft.com/office/word/2006/wordml" xmlns:wps="http://schemas.microsoft.com/office/word/2010/wordprocessingShape" mc:Ignorable="w14 w15 w16se w16cid w16 w16cex w16sdtdh wp14">
+<w:ftr xmlns:wpc="http://schemas.microsoft.com/office/word/2010/wordprocessingCanvas" xmlns:cx="http://schemas.microsoft.com/office/drawing/2014/chartex" xmlns:cx1="http://schemas.microsoft.com/office/drawing/2015/9/8/chartex" xmlns:cx2="http://schemas.microsoft.com/office/drawing/2015/10/21/chartex" xmlns:cx3="http://schemas.microsoft.com/office/drawing/2016/5/9/chartex" xmlns:cx4="http://schemas.microsoft.com/office/drawing/2016/5/10/chartex" xmlns:cx5="http://schemas.microsoft.com/office/drawing/2016/5/11/chartex" xmlns:cx6="http://schemas.microsoft.com/office/drawing/2016/5/12/chartex" xmlns:cx7="http://schemas.microsoft.com/office/drawing/2016/5/13/chartex" xmlns:cx8="http://schemas.microsoft.com/office/drawing/2016/5/14/chartex" xmlns:mc="http://schemas.openxmlformats.org/markup-compatibility/2006" xmlns:aink="http://schemas.microsoft.com/office/drawing/2016/ink" xmlns:am3d="http://schemas.microsoft.com/office/drawing/2017/model3d" xmlns:o="urn:schemas-microsoft-com:office:office" xmlns:r="http://schemas.openxmlformats.org/officeDocument/2006/relationships" xmlns:m="http://schemas.openxmlformats.org/officeDocument/2006/math" xmlns:v="urn:schemas-microsoft-com:vml" xmlns:wp14="http://schemas.microsoft.com/office/word/2010/wordprocessingDrawing" xmlns:wp="http://schemas.openxmlformats.org/drawingml/2006/wordprocessingDrawing" xmlns:w10="urn:schemas-microsoft-com:office:word" xmlns:w="http://schemas.openxmlformats.org/wordprocessingml/2006/main" xmlns:w14="http://schemas.microsoft.com/office/word/2010/wordml" xmlns:w15="http://schemas.microsoft.com/office/word/2012/wordml" xmlns:w16cex="http://schemas.microsoft.com/office/word/2018/wordml/cex" xmlns:w16cid="http://schemas.microsoft.com/office/word/2016/wordml/cid" xmlns:w16="http://schemas.microsoft.com/office/word/2018/wordml" xmlns:w16se="http://schemas.microsoft.com/office/word/2015/wordml/symex" xmlns:wpg="http://schemas.microsoft.com/office/word/2010/wordprocessingGroup" xmlns:wpi="http://schemas.microsoft.com/office/word/2010/wordprocessingInk" xmlns:wne="http://schemas.microsoft.com/office/word/2006/wordml" xmlns:wps="http://schemas.microsoft.com/office/word/2010/wordprocessingShape" mc:Ignorable="w14 w15 w16se w16cid w16 w16cex wp14">
   <w:tbl>
     <w:tblPr>
       <w:tblW w:w="9486" w:type="dxa"/>
@@ -5157,13 +5053,8 @@
               <w:lang w:val="pt-BR"/>
             </w:rPr>
           </w:pPr>
-          <w:proofErr w:type="spellStart"/>
           <w:r>
-            <w:t>Engenharia</w:t>
-          </w:r>
-          <w:proofErr w:type="spellEnd"/>
-          <w:r>
-            <w:t xml:space="preserve"> de Software</w:t>
+            <w:t>Engenharia de Software</w:t>
           </w:r>
           <w:r>
             <w:rPr>
@@ -5237,23 +5128,7 @@
               <w:rStyle w:val="Nmerodepgina"/>
               <w:lang w:val="pt-BR"/>
             </w:rPr>
-            <w:t xml:space="preserve"> </w:t>
-          </w:r>
-          <w:proofErr w:type="spellStart"/>
-          <w:r>
-            <w:rPr>
-              <w:rStyle w:val="Nmerodepgina"/>
-              <w:lang w:val="pt-BR"/>
-            </w:rPr>
-            <w:t>of</w:t>
-          </w:r>
-          <w:proofErr w:type="spellEnd"/>
-          <w:r>
-            <w:rPr>
-              <w:rStyle w:val="Nmerodepgina"/>
-              <w:lang w:val="pt-BR"/>
-            </w:rPr>
-            <w:t xml:space="preserve"> </w:t>
+            <w:t xml:space="preserve"> of </w:t>
           </w:r>
           <w:r>
             <w:rPr>
@@ -5299,7 +5174,7 @@
 </file>
 
 <file path=word/footnotes.xml><?xml version="1.0" encoding="utf-8"?>
-<w:footnotes xmlns:wpc="http://schemas.microsoft.com/office/word/2010/wordprocessingCanvas" xmlns:cx="http://schemas.microsoft.com/office/drawing/2014/chartex" xmlns:cx1="http://schemas.microsoft.com/office/drawing/2015/9/8/chartex" xmlns:cx2="http://schemas.microsoft.com/office/drawing/2015/10/21/chartex" xmlns:cx3="http://schemas.microsoft.com/office/drawing/2016/5/9/chartex" xmlns:cx4="http://schemas.microsoft.com/office/drawing/2016/5/10/chartex" xmlns:cx5="http://schemas.microsoft.com/office/drawing/2016/5/11/chartex" xmlns:cx6="http://schemas.microsoft.com/office/drawing/2016/5/12/chartex" xmlns:cx7="http://schemas.microsoft.com/office/drawing/2016/5/13/chartex" xmlns:cx8="http://schemas.microsoft.com/office/drawing/2016/5/14/chartex" xmlns:mc="http://schemas.openxmlformats.org/markup-compatibility/2006" xmlns:aink="http://schemas.microsoft.com/office/drawing/2016/ink" xmlns:am3d="http://schemas.microsoft.com/office/drawing/2017/model3d" xmlns:o="urn:schemas-microsoft-com:office:office" xmlns:r="http://schemas.openxmlformats.org/officeDocument/2006/relationships" xmlns:m="http://schemas.openxmlformats.org/officeDocument/2006/math" xmlns:v="urn:schemas-microsoft-com:vml" xmlns:wp14="http://schemas.microsoft.com/office/word/2010/wordprocessingDrawing" xmlns:wp="http://schemas.openxmlformats.org/drawingml/2006/wordprocessingDrawing" xmlns:w10="urn:schemas-microsoft-com:office:word" xmlns:w="http://schemas.openxmlformats.org/wordprocessingml/2006/main" xmlns:w14="http://schemas.microsoft.com/office/word/2010/wordml" xmlns:w15="http://schemas.microsoft.com/office/word/2012/wordml" xmlns:w16cex="http://schemas.microsoft.com/office/word/2018/wordml/cex" xmlns:w16cid="http://schemas.microsoft.com/office/word/2016/wordml/cid" xmlns:w16="http://schemas.microsoft.com/office/word/2018/wordml" xmlns:w16sdtdh="http://schemas.microsoft.com/office/word/2020/wordml/sdtdatahash" xmlns:w16se="http://schemas.microsoft.com/office/word/2015/wordml/symex" xmlns:wpg="http://schemas.microsoft.com/office/word/2010/wordprocessingGroup" xmlns:wpi="http://schemas.microsoft.com/office/word/2010/wordprocessingInk" xmlns:wne="http://schemas.microsoft.com/office/word/2006/wordml" xmlns:wps="http://schemas.microsoft.com/office/word/2010/wordprocessingShape" mc:Ignorable="w14 w15 w16se w16cid w16 w16cex w16sdtdh wp14">
+<w:footnotes xmlns:wpc="http://schemas.microsoft.com/office/word/2010/wordprocessingCanvas" xmlns:cx="http://schemas.microsoft.com/office/drawing/2014/chartex" xmlns:cx1="http://schemas.microsoft.com/office/drawing/2015/9/8/chartex" xmlns:cx2="http://schemas.microsoft.com/office/drawing/2015/10/21/chartex" xmlns:cx3="http://schemas.microsoft.com/office/drawing/2016/5/9/chartex" xmlns:cx4="http://schemas.microsoft.com/office/drawing/2016/5/10/chartex" xmlns:cx5="http://schemas.microsoft.com/office/drawing/2016/5/11/chartex" xmlns:cx6="http://schemas.microsoft.com/office/drawing/2016/5/12/chartex" xmlns:cx7="http://schemas.microsoft.com/office/drawing/2016/5/13/chartex" xmlns:cx8="http://schemas.microsoft.com/office/drawing/2016/5/14/chartex" xmlns:mc="http://schemas.openxmlformats.org/markup-compatibility/2006" xmlns:aink="http://schemas.microsoft.com/office/drawing/2016/ink" xmlns:am3d="http://schemas.microsoft.com/office/drawing/2017/model3d" xmlns:o="urn:schemas-microsoft-com:office:office" xmlns:r="http://schemas.openxmlformats.org/officeDocument/2006/relationships" xmlns:m="http://schemas.openxmlformats.org/officeDocument/2006/math" xmlns:v="urn:schemas-microsoft-com:vml" xmlns:wp14="http://schemas.microsoft.com/office/word/2010/wordprocessingDrawing" xmlns:wp="http://schemas.openxmlformats.org/drawingml/2006/wordprocessingDrawing" xmlns:w10="urn:schemas-microsoft-com:office:word" xmlns:w="http://schemas.openxmlformats.org/wordprocessingml/2006/main" xmlns:w14="http://schemas.microsoft.com/office/word/2010/wordml" xmlns:w15="http://schemas.microsoft.com/office/word/2012/wordml" xmlns:w16cex="http://schemas.microsoft.com/office/word/2018/wordml/cex" xmlns:w16cid="http://schemas.microsoft.com/office/word/2016/wordml/cid" xmlns:w16="http://schemas.microsoft.com/office/word/2018/wordml" xmlns:w16se="http://schemas.microsoft.com/office/word/2015/wordml/symex" xmlns:wpg="http://schemas.microsoft.com/office/word/2010/wordprocessingGroup" xmlns:wpi="http://schemas.microsoft.com/office/word/2010/wordprocessingInk" xmlns:wne="http://schemas.microsoft.com/office/word/2006/wordml" xmlns:wps="http://schemas.microsoft.com/office/word/2010/wordprocessingShape" mc:Ignorable="w14 w15 w16se w16cid w16 w16cex wp14">
   <w:footnote w:type="separator" w:id="-1">
     <w:p>
       <w:pPr>
@@ -5324,7 +5199,7 @@
 </file>
 
 <file path=word/header1.xml><?xml version="1.0" encoding="utf-8"?>
-<w:hdr xmlns:wpc="http://schemas.microsoft.com/office/word/2010/wordprocessingCanvas" xmlns:cx="http://schemas.microsoft.com/office/drawing/2014/chartex" xmlns:cx1="http://schemas.microsoft.com/office/drawing/2015/9/8/chartex" xmlns:cx2="http://schemas.microsoft.com/office/drawing/2015/10/21/chartex" xmlns:cx3="http://schemas.microsoft.com/office/drawing/2016/5/9/chartex" xmlns:cx4="http://schemas.microsoft.com/office/drawing/2016/5/10/chartex" xmlns:cx5="http://schemas.microsoft.com/office/drawing/2016/5/11/chartex" xmlns:cx6="http://schemas.microsoft.com/office/drawing/2016/5/12/chartex" xmlns:cx7="http://schemas.microsoft.com/office/drawing/2016/5/13/chartex" xmlns:cx8="http://schemas.microsoft.com/office/drawing/2016/5/14/chartex" xmlns:mc="http://schemas.openxmlformats.org/markup-compatibility/2006" xmlns:aink="http://schemas.microsoft.com/office/drawing/2016/ink" xmlns:am3d="http://schemas.microsoft.com/office/drawing/2017/model3d" xmlns:o="urn:schemas-microsoft-com:office:office" xmlns:r="http://schemas.openxmlformats.org/officeDocument/2006/relationships" xmlns:m="http://schemas.openxmlformats.org/officeDocument/2006/math" xmlns:v="urn:schemas-microsoft-com:vml" xmlns:wp14="http://schemas.microsoft.com/office/word/2010/wordprocessingDrawing" xmlns:wp="http://schemas.openxmlformats.org/drawingml/2006/wordprocessingDrawing" xmlns:w10="urn:schemas-microsoft-com:office:word" xmlns:w="http://schemas.openxmlformats.org/wordprocessingml/2006/main" xmlns:w14="http://schemas.microsoft.com/office/word/2010/wordml" xmlns:w15="http://schemas.microsoft.com/office/word/2012/wordml" xmlns:w16cex="http://schemas.microsoft.com/office/word/2018/wordml/cex" xmlns:w16cid="http://schemas.microsoft.com/office/word/2016/wordml/cid" xmlns:w16="http://schemas.microsoft.com/office/word/2018/wordml" xmlns:w16sdtdh="http://schemas.microsoft.com/office/word/2020/wordml/sdtdatahash" xmlns:w16se="http://schemas.microsoft.com/office/word/2015/wordml/symex" xmlns:wpg="http://schemas.microsoft.com/office/word/2010/wordprocessingGroup" xmlns:wpi="http://schemas.microsoft.com/office/word/2010/wordprocessingInk" xmlns:wne="http://schemas.microsoft.com/office/word/2006/wordml" xmlns:wps="http://schemas.microsoft.com/office/word/2010/wordprocessingShape" mc:Ignorable="w14 w15 w16se w16cid w16 w16cex w16sdtdh wp14">
+<w:hdr xmlns:wpc="http://schemas.microsoft.com/office/word/2010/wordprocessingCanvas" xmlns:cx="http://schemas.microsoft.com/office/drawing/2014/chartex" xmlns:cx1="http://schemas.microsoft.com/office/drawing/2015/9/8/chartex" xmlns:cx2="http://schemas.microsoft.com/office/drawing/2015/10/21/chartex" xmlns:cx3="http://schemas.microsoft.com/office/drawing/2016/5/9/chartex" xmlns:cx4="http://schemas.microsoft.com/office/drawing/2016/5/10/chartex" xmlns:cx5="http://schemas.microsoft.com/office/drawing/2016/5/11/chartex" xmlns:cx6="http://schemas.microsoft.com/office/drawing/2016/5/12/chartex" xmlns:cx7="http://schemas.microsoft.com/office/drawing/2016/5/13/chartex" xmlns:cx8="http://schemas.microsoft.com/office/drawing/2016/5/14/chartex" xmlns:mc="http://schemas.openxmlformats.org/markup-compatibility/2006" xmlns:aink="http://schemas.microsoft.com/office/drawing/2016/ink" xmlns:am3d="http://schemas.microsoft.com/office/drawing/2017/model3d" xmlns:o="urn:schemas-microsoft-com:office:office" xmlns:r="http://schemas.openxmlformats.org/officeDocument/2006/relationships" xmlns:m="http://schemas.openxmlformats.org/officeDocument/2006/math" xmlns:v="urn:schemas-microsoft-com:vml" xmlns:wp14="http://schemas.microsoft.com/office/word/2010/wordprocessingDrawing" xmlns:wp="http://schemas.openxmlformats.org/drawingml/2006/wordprocessingDrawing" xmlns:w10="urn:schemas-microsoft-com:office:word" xmlns:w="http://schemas.openxmlformats.org/wordprocessingml/2006/main" xmlns:w14="http://schemas.microsoft.com/office/word/2010/wordml" xmlns:w15="http://schemas.microsoft.com/office/word/2012/wordml" xmlns:w16cex="http://schemas.microsoft.com/office/word/2018/wordml/cex" xmlns:w16cid="http://schemas.microsoft.com/office/word/2016/wordml/cid" xmlns:w16="http://schemas.microsoft.com/office/word/2018/wordml" xmlns:w16se="http://schemas.microsoft.com/office/word/2015/wordml/symex" xmlns:wpg="http://schemas.microsoft.com/office/word/2010/wordprocessingGroup" xmlns:wpi="http://schemas.microsoft.com/office/word/2010/wordprocessingInk" xmlns:wne="http://schemas.microsoft.com/office/word/2006/wordml" xmlns:wps="http://schemas.microsoft.com/office/word/2010/wordprocessingShape" mc:Ignorable="w14 w15 w16se w16cid w16 w16cex wp14">
   <w:p>
     <w:pPr>
       <w:rPr>
@@ -5357,7 +5232,6 @@
         <w:szCs w:val="36"/>
       </w:rPr>
     </w:pPr>
-    <w:proofErr w:type="spellStart"/>
     <w:r>
       <w:rPr>
         <w:b/>
@@ -5365,17 +5239,7 @@
         <w:sz w:val="36"/>
         <w:szCs w:val="36"/>
       </w:rPr>
-      <w:t>Engenharia</w:t>
-    </w:r>
-    <w:proofErr w:type="spellEnd"/>
-    <w:r>
-      <w:rPr>
-        <w:b/>
-        <w:bCs/>
-        <w:sz w:val="36"/>
-        <w:szCs w:val="36"/>
-      </w:rPr>
-      <w:t xml:space="preserve"> de Software 2</w:t>
+      <w:t>Engenharia de Software 2</w:t>
     </w:r>
   </w:p>
   <w:p>
@@ -5399,7 +5263,7 @@
 </file>
 
 <file path=word/header2.xml><?xml version="1.0" encoding="utf-8"?>
-<w:hdr xmlns:wpc="http://schemas.microsoft.com/office/word/2010/wordprocessingCanvas" xmlns:cx="http://schemas.microsoft.com/office/drawing/2014/chartex" xmlns:cx1="http://schemas.microsoft.com/office/drawing/2015/9/8/chartex" xmlns:cx2="http://schemas.microsoft.com/office/drawing/2015/10/21/chartex" xmlns:cx3="http://schemas.microsoft.com/office/drawing/2016/5/9/chartex" xmlns:cx4="http://schemas.microsoft.com/office/drawing/2016/5/10/chartex" xmlns:cx5="http://schemas.microsoft.com/office/drawing/2016/5/11/chartex" xmlns:cx6="http://schemas.microsoft.com/office/drawing/2016/5/12/chartex" xmlns:cx7="http://schemas.microsoft.com/office/drawing/2016/5/13/chartex" xmlns:cx8="http://schemas.microsoft.com/office/drawing/2016/5/14/chartex" xmlns:mc="http://schemas.openxmlformats.org/markup-compatibility/2006" xmlns:aink="http://schemas.microsoft.com/office/drawing/2016/ink" xmlns:am3d="http://schemas.microsoft.com/office/drawing/2017/model3d" xmlns:o="urn:schemas-microsoft-com:office:office" xmlns:r="http://schemas.openxmlformats.org/officeDocument/2006/relationships" xmlns:m="http://schemas.openxmlformats.org/officeDocument/2006/math" xmlns:v="urn:schemas-microsoft-com:vml" xmlns:wp14="http://schemas.microsoft.com/office/word/2010/wordprocessingDrawing" xmlns:wp="http://schemas.openxmlformats.org/drawingml/2006/wordprocessingDrawing" xmlns:w10="urn:schemas-microsoft-com:office:word" xmlns:w="http://schemas.openxmlformats.org/wordprocessingml/2006/main" xmlns:w14="http://schemas.microsoft.com/office/word/2010/wordml" xmlns:w15="http://schemas.microsoft.com/office/word/2012/wordml" xmlns:w16cex="http://schemas.microsoft.com/office/word/2018/wordml/cex" xmlns:w16cid="http://schemas.microsoft.com/office/word/2016/wordml/cid" xmlns:w16="http://schemas.microsoft.com/office/word/2018/wordml" xmlns:w16sdtdh="http://schemas.microsoft.com/office/word/2020/wordml/sdtdatahash" xmlns:w16se="http://schemas.microsoft.com/office/word/2015/wordml/symex" xmlns:wpg="http://schemas.microsoft.com/office/word/2010/wordprocessingGroup" xmlns:wpi="http://schemas.microsoft.com/office/word/2010/wordprocessingInk" xmlns:wne="http://schemas.microsoft.com/office/word/2006/wordml" xmlns:wps="http://schemas.microsoft.com/office/word/2010/wordprocessingShape" mc:Ignorable="w14 w15 w16se w16cid w16 w16cex w16sdtdh wp14">
+<w:hdr xmlns:wpc="http://schemas.microsoft.com/office/word/2010/wordprocessingCanvas" xmlns:cx="http://schemas.microsoft.com/office/drawing/2014/chartex" xmlns:cx1="http://schemas.microsoft.com/office/drawing/2015/9/8/chartex" xmlns:cx2="http://schemas.microsoft.com/office/drawing/2015/10/21/chartex" xmlns:cx3="http://schemas.microsoft.com/office/drawing/2016/5/9/chartex" xmlns:cx4="http://schemas.microsoft.com/office/drawing/2016/5/10/chartex" xmlns:cx5="http://schemas.microsoft.com/office/drawing/2016/5/11/chartex" xmlns:cx6="http://schemas.microsoft.com/office/drawing/2016/5/12/chartex" xmlns:cx7="http://schemas.microsoft.com/office/drawing/2016/5/13/chartex" xmlns:cx8="http://schemas.microsoft.com/office/drawing/2016/5/14/chartex" xmlns:mc="http://schemas.openxmlformats.org/markup-compatibility/2006" xmlns:aink="http://schemas.microsoft.com/office/drawing/2016/ink" xmlns:am3d="http://schemas.microsoft.com/office/drawing/2017/model3d" xmlns:o="urn:schemas-microsoft-com:office:office" xmlns:r="http://schemas.openxmlformats.org/officeDocument/2006/relationships" xmlns:m="http://schemas.openxmlformats.org/officeDocument/2006/math" xmlns:v="urn:schemas-microsoft-com:vml" xmlns:wp14="http://schemas.microsoft.com/office/word/2010/wordprocessingDrawing" xmlns:wp="http://schemas.openxmlformats.org/drawingml/2006/wordprocessingDrawing" xmlns:w10="urn:schemas-microsoft-com:office:word" xmlns:w="http://schemas.openxmlformats.org/wordprocessingml/2006/main" xmlns:w14="http://schemas.microsoft.com/office/word/2010/wordml" xmlns:w15="http://schemas.microsoft.com/office/word/2012/wordml" xmlns:w16cex="http://schemas.microsoft.com/office/word/2018/wordml/cex" xmlns:w16cid="http://schemas.microsoft.com/office/word/2016/wordml/cid" xmlns:w16="http://schemas.microsoft.com/office/word/2018/wordml" xmlns:w16se="http://schemas.microsoft.com/office/word/2015/wordml/symex" xmlns:wpg="http://schemas.microsoft.com/office/word/2010/wordprocessingGroup" xmlns:wpi="http://schemas.microsoft.com/office/word/2010/wordprocessingInk" xmlns:wne="http://schemas.microsoft.com/office/word/2006/wordml" xmlns:wps="http://schemas.microsoft.com/office/word/2010/wordprocessingShape" mc:Ignorable="w14 w15 w16se w16cid w16 w16cex wp14">
   <w:tbl>
     <w:tblPr>
       <w:tblW w:w="9558" w:type="dxa"/>
@@ -5427,14 +5291,12 @@
               <w:lang w:val="pt-BR"/>
             </w:rPr>
           </w:pPr>
-          <w:proofErr w:type="spellStart"/>
           <w:r>
             <w:rPr>
               <w:lang w:val="pt-BR"/>
             </w:rPr>
             <w:t>DeliFit</w:t>
           </w:r>
-          <w:proofErr w:type="spellEnd"/>
         </w:p>
       </w:tc>
       <w:tc>
@@ -5555,13 +5417,13 @@
 </file>
 
 <file path=word/header3.xml><?xml version="1.0" encoding="utf-8"?>
-<w:hdr xmlns:wpc="http://schemas.microsoft.com/office/word/2010/wordprocessingCanvas" xmlns:cx="http://schemas.microsoft.com/office/drawing/2014/chartex" xmlns:cx1="http://schemas.microsoft.com/office/drawing/2015/9/8/chartex" xmlns:cx2="http://schemas.microsoft.com/office/drawing/2015/10/21/chartex" xmlns:cx3="http://schemas.microsoft.com/office/drawing/2016/5/9/chartex" xmlns:cx4="http://schemas.microsoft.com/office/drawing/2016/5/10/chartex" xmlns:cx5="http://schemas.microsoft.com/office/drawing/2016/5/11/chartex" xmlns:cx6="http://schemas.microsoft.com/office/drawing/2016/5/12/chartex" xmlns:cx7="http://schemas.microsoft.com/office/drawing/2016/5/13/chartex" xmlns:cx8="http://schemas.microsoft.com/office/drawing/2016/5/14/chartex" xmlns:mc="http://schemas.openxmlformats.org/markup-compatibility/2006" xmlns:aink="http://schemas.microsoft.com/office/drawing/2016/ink" xmlns:am3d="http://schemas.microsoft.com/office/drawing/2017/model3d" xmlns:o="urn:schemas-microsoft-com:office:office" xmlns:r="http://schemas.openxmlformats.org/officeDocument/2006/relationships" xmlns:m="http://schemas.openxmlformats.org/officeDocument/2006/math" xmlns:v="urn:schemas-microsoft-com:vml" xmlns:wp14="http://schemas.microsoft.com/office/word/2010/wordprocessingDrawing" xmlns:wp="http://schemas.openxmlformats.org/drawingml/2006/wordprocessingDrawing" xmlns:w10="urn:schemas-microsoft-com:office:word" xmlns:w="http://schemas.openxmlformats.org/wordprocessingml/2006/main" xmlns:w14="http://schemas.microsoft.com/office/word/2010/wordml" xmlns:w15="http://schemas.microsoft.com/office/word/2012/wordml" xmlns:w16cex="http://schemas.microsoft.com/office/word/2018/wordml/cex" xmlns:w16cid="http://schemas.microsoft.com/office/word/2016/wordml/cid" xmlns:w16="http://schemas.microsoft.com/office/word/2018/wordml" xmlns:w16sdtdh="http://schemas.microsoft.com/office/word/2020/wordml/sdtdatahash" xmlns:w16se="http://schemas.microsoft.com/office/word/2015/wordml/symex" xmlns:wpg="http://schemas.microsoft.com/office/word/2010/wordprocessingGroup" xmlns:wpi="http://schemas.microsoft.com/office/word/2010/wordprocessingInk" xmlns:wne="http://schemas.microsoft.com/office/word/2006/wordml" xmlns:wps="http://schemas.microsoft.com/office/word/2010/wordprocessingShape" mc:Ignorable="w14 w15 w16se w16cid w16 w16cex w16sdtdh wp14">
+<w:hdr xmlns:wpc="http://schemas.microsoft.com/office/word/2010/wordprocessingCanvas" xmlns:cx="http://schemas.microsoft.com/office/drawing/2014/chartex" xmlns:cx1="http://schemas.microsoft.com/office/drawing/2015/9/8/chartex" xmlns:cx2="http://schemas.microsoft.com/office/drawing/2015/10/21/chartex" xmlns:cx3="http://schemas.microsoft.com/office/drawing/2016/5/9/chartex" xmlns:cx4="http://schemas.microsoft.com/office/drawing/2016/5/10/chartex" xmlns:cx5="http://schemas.microsoft.com/office/drawing/2016/5/11/chartex" xmlns:cx6="http://schemas.microsoft.com/office/drawing/2016/5/12/chartex" xmlns:cx7="http://schemas.microsoft.com/office/drawing/2016/5/13/chartex" xmlns:cx8="http://schemas.microsoft.com/office/drawing/2016/5/14/chartex" xmlns:mc="http://schemas.openxmlformats.org/markup-compatibility/2006" xmlns:aink="http://schemas.microsoft.com/office/drawing/2016/ink" xmlns:am3d="http://schemas.microsoft.com/office/drawing/2017/model3d" xmlns:o="urn:schemas-microsoft-com:office:office" xmlns:r="http://schemas.openxmlformats.org/officeDocument/2006/relationships" xmlns:m="http://schemas.openxmlformats.org/officeDocument/2006/math" xmlns:v="urn:schemas-microsoft-com:vml" xmlns:wp14="http://schemas.microsoft.com/office/word/2010/wordprocessingDrawing" xmlns:wp="http://schemas.openxmlformats.org/drawingml/2006/wordprocessingDrawing" xmlns:w10="urn:schemas-microsoft-com:office:word" xmlns:w="http://schemas.openxmlformats.org/wordprocessingml/2006/main" xmlns:w14="http://schemas.microsoft.com/office/word/2010/wordml" xmlns:w15="http://schemas.microsoft.com/office/word/2012/wordml" xmlns:w16cex="http://schemas.microsoft.com/office/word/2018/wordml/cex" xmlns:w16cid="http://schemas.microsoft.com/office/word/2016/wordml/cid" xmlns:w16="http://schemas.microsoft.com/office/word/2018/wordml" xmlns:w16se="http://schemas.microsoft.com/office/word/2015/wordml/symex" xmlns:wpg="http://schemas.microsoft.com/office/word/2010/wordprocessingGroup" xmlns:wpi="http://schemas.microsoft.com/office/word/2010/wordprocessingInk" xmlns:wne="http://schemas.microsoft.com/office/word/2006/wordml" xmlns:wps="http://schemas.microsoft.com/office/word/2010/wordprocessingShape" mc:Ignorable="w14 w15 w16se w16cid w16 w16cex wp14">
   <w:p/>
 </w:hdr>
 </file>
 
 <file path=word/numbering.xml><?xml version="1.0" encoding="utf-8"?>
-<w:numbering xmlns:wpc="http://schemas.microsoft.com/office/word/2010/wordprocessingCanvas" xmlns:cx="http://schemas.microsoft.com/office/drawing/2014/chartex" xmlns:cx1="http://schemas.microsoft.com/office/drawing/2015/9/8/chartex" xmlns:cx2="http://schemas.microsoft.com/office/drawing/2015/10/21/chartex" xmlns:cx3="http://schemas.microsoft.com/office/drawing/2016/5/9/chartex" xmlns:cx4="http://schemas.microsoft.com/office/drawing/2016/5/10/chartex" xmlns:cx5="http://schemas.microsoft.com/office/drawing/2016/5/11/chartex" xmlns:cx6="http://schemas.microsoft.com/office/drawing/2016/5/12/chartex" xmlns:cx7="http://schemas.microsoft.com/office/drawing/2016/5/13/chartex" xmlns:cx8="http://schemas.microsoft.com/office/drawing/2016/5/14/chartex" xmlns:mc="http://schemas.openxmlformats.org/markup-compatibility/2006" xmlns:aink="http://schemas.microsoft.com/office/drawing/2016/ink" xmlns:am3d="http://schemas.microsoft.com/office/drawing/2017/model3d" xmlns:o="urn:schemas-microsoft-com:office:office" xmlns:r="http://schemas.openxmlformats.org/officeDocument/2006/relationships" xmlns:m="http://schemas.openxmlformats.org/officeDocument/2006/math" xmlns:v="urn:schemas-microsoft-com:vml" xmlns:wp14="http://schemas.microsoft.com/office/word/2010/wordprocessingDrawing" xmlns:wp="http://schemas.openxmlformats.org/drawingml/2006/wordprocessingDrawing" xmlns:w10="urn:schemas-microsoft-com:office:word" xmlns:w="http://schemas.openxmlformats.org/wordprocessingml/2006/main" xmlns:w14="http://schemas.microsoft.com/office/word/2010/wordml" xmlns:w15="http://schemas.microsoft.com/office/word/2012/wordml" xmlns:w16cex="http://schemas.microsoft.com/office/word/2018/wordml/cex" xmlns:w16cid="http://schemas.microsoft.com/office/word/2016/wordml/cid" xmlns:w16="http://schemas.microsoft.com/office/word/2018/wordml" xmlns:w16sdtdh="http://schemas.microsoft.com/office/word/2020/wordml/sdtdatahash" xmlns:w16se="http://schemas.microsoft.com/office/word/2015/wordml/symex" xmlns:wpg="http://schemas.microsoft.com/office/word/2010/wordprocessingGroup" xmlns:wpi="http://schemas.microsoft.com/office/word/2010/wordprocessingInk" xmlns:wne="http://schemas.microsoft.com/office/word/2006/wordml" xmlns:wps="http://schemas.microsoft.com/office/word/2010/wordprocessingShape" mc:Ignorable="w14 w15 w16se w16cid w16 w16cex w16sdtdh wp14">
+<w:numbering xmlns:wpc="http://schemas.microsoft.com/office/word/2010/wordprocessingCanvas" xmlns:cx="http://schemas.microsoft.com/office/drawing/2014/chartex" xmlns:cx1="http://schemas.microsoft.com/office/drawing/2015/9/8/chartex" xmlns:cx2="http://schemas.microsoft.com/office/drawing/2015/10/21/chartex" xmlns:cx3="http://schemas.microsoft.com/office/drawing/2016/5/9/chartex" xmlns:cx4="http://schemas.microsoft.com/office/drawing/2016/5/10/chartex" xmlns:cx5="http://schemas.microsoft.com/office/drawing/2016/5/11/chartex" xmlns:cx6="http://schemas.microsoft.com/office/drawing/2016/5/12/chartex" xmlns:cx7="http://schemas.microsoft.com/office/drawing/2016/5/13/chartex" xmlns:cx8="http://schemas.microsoft.com/office/drawing/2016/5/14/chartex" xmlns:mc="http://schemas.openxmlformats.org/markup-compatibility/2006" xmlns:aink="http://schemas.microsoft.com/office/drawing/2016/ink" xmlns:am3d="http://schemas.microsoft.com/office/drawing/2017/model3d" xmlns:o="urn:schemas-microsoft-com:office:office" xmlns:r="http://schemas.openxmlformats.org/officeDocument/2006/relationships" xmlns:m="http://schemas.openxmlformats.org/officeDocument/2006/math" xmlns:v="urn:schemas-microsoft-com:vml" xmlns:wp14="http://schemas.microsoft.com/office/word/2010/wordprocessingDrawing" xmlns:wp="http://schemas.openxmlformats.org/drawingml/2006/wordprocessingDrawing" xmlns:w10="urn:schemas-microsoft-com:office:word" xmlns:w="http://schemas.openxmlformats.org/wordprocessingml/2006/main" xmlns:w14="http://schemas.microsoft.com/office/word/2010/wordml" xmlns:w15="http://schemas.microsoft.com/office/word/2012/wordml" xmlns:w16cex="http://schemas.microsoft.com/office/word/2018/wordml/cex" xmlns:w16cid="http://schemas.microsoft.com/office/word/2016/wordml/cid" xmlns:w16="http://schemas.microsoft.com/office/word/2018/wordml" xmlns:w16se="http://schemas.microsoft.com/office/word/2015/wordml/symex" xmlns:wpg="http://schemas.microsoft.com/office/word/2010/wordprocessingGroup" xmlns:wpi="http://schemas.microsoft.com/office/word/2010/wordprocessingInk" xmlns:wne="http://schemas.microsoft.com/office/word/2006/wordml" xmlns:wps="http://schemas.microsoft.com/office/word/2010/wordprocessingShape" mc:Ignorable="w14 w15 w16se w16cid w16 w16cex wp14">
   <w:abstractNum w:abstractNumId="0" w15:restartNumberingAfterBreak="0">
     <w:nsid w:val="92FFF340"/>
     <w:multiLevelType w:val="multilevel"/>
@@ -6665,7 +6527,7 @@
 </file>
 
 <file path=word/styles.xml><?xml version="1.0" encoding="utf-8"?>
-<w:styles xmlns:mc="http://schemas.openxmlformats.org/markup-compatibility/2006" xmlns:r="http://schemas.openxmlformats.org/officeDocument/2006/relationships" xmlns:w="http://schemas.openxmlformats.org/wordprocessingml/2006/main" xmlns:w14="http://schemas.microsoft.com/office/word/2010/wordml" xmlns:w15="http://schemas.microsoft.com/office/word/2012/wordml" xmlns:w16cex="http://schemas.microsoft.com/office/word/2018/wordml/cex" xmlns:w16cid="http://schemas.microsoft.com/office/word/2016/wordml/cid" xmlns:w16="http://schemas.microsoft.com/office/word/2018/wordml" xmlns:w16sdtdh="http://schemas.microsoft.com/office/word/2020/wordml/sdtdatahash" xmlns:w16se="http://schemas.microsoft.com/office/word/2015/wordml/symex" mc:Ignorable="w14 w15 w16se w16cid w16 w16cex w16sdtdh">
+<w:styles xmlns:mc="http://schemas.openxmlformats.org/markup-compatibility/2006" xmlns:r="http://schemas.openxmlformats.org/officeDocument/2006/relationships" xmlns:w="http://schemas.openxmlformats.org/wordprocessingml/2006/main" xmlns:w14="http://schemas.microsoft.com/office/word/2010/wordml" xmlns:w15="http://schemas.microsoft.com/office/word/2012/wordml" xmlns:w16cex="http://schemas.microsoft.com/office/word/2018/wordml/cex" xmlns:w16cid="http://schemas.microsoft.com/office/word/2016/wordml/cid" xmlns:w16="http://schemas.microsoft.com/office/word/2018/wordml" xmlns:w16se="http://schemas.microsoft.com/office/word/2015/wordml/symex" mc:Ignorable="w14 w15 w16se w16cid w16 w16cex">
   <w:docDefaults>
     <w:rPrDefault>
       <w:rPr>

</xml_diff>

<commit_message>
Corrigida a imagem do diagrama de implantação do documento de arquitetura Issue#54
</commit_message>
<xml_diff>
--- a/AnaliseProjeto/Documento de Arquitetura.docx
+++ b/AnaliseProjeto/Documento de Arquitetura.docx
@@ -1,6 +1,6 @@
 
 <file path=word/document.xml><?xml version="1.0" encoding="utf-8"?>
-<w:document xmlns:wpc="http://schemas.microsoft.com/office/word/2010/wordprocessingCanvas" xmlns:cx="http://schemas.microsoft.com/office/drawing/2014/chartex" xmlns:cx1="http://schemas.microsoft.com/office/drawing/2015/9/8/chartex" xmlns:cx2="http://schemas.microsoft.com/office/drawing/2015/10/21/chartex" xmlns:cx3="http://schemas.microsoft.com/office/drawing/2016/5/9/chartex" xmlns:cx4="http://schemas.microsoft.com/office/drawing/2016/5/10/chartex" xmlns:cx5="http://schemas.microsoft.com/office/drawing/2016/5/11/chartex" xmlns:cx6="http://schemas.microsoft.com/office/drawing/2016/5/12/chartex" xmlns:cx7="http://schemas.microsoft.com/office/drawing/2016/5/13/chartex" xmlns:cx8="http://schemas.microsoft.com/office/drawing/2016/5/14/chartex" xmlns:mc="http://schemas.openxmlformats.org/markup-compatibility/2006" xmlns:aink="http://schemas.microsoft.com/office/drawing/2016/ink" xmlns:am3d="http://schemas.microsoft.com/office/drawing/2017/model3d" xmlns:o="urn:schemas-microsoft-com:office:office" xmlns:r="http://schemas.openxmlformats.org/officeDocument/2006/relationships" xmlns:m="http://schemas.openxmlformats.org/officeDocument/2006/math" xmlns:v="urn:schemas-microsoft-com:vml" xmlns:wp14="http://schemas.microsoft.com/office/word/2010/wordprocessingDrawing" xmlns:wp="http://schemas.openxmlformats.org/drawingml/2006/wordprocessingDrawing" xmlns:w10="urn:schemas-microsoft-com:office:word" xmlns:w="http://schemas.openxmlformats.org/wordprocessingml/2006/main" xmlns:w14="http://schemas.microsoft.com/office/word/2010/wordml" xmlns:w15="http://schemas.microsoft.com/office/word/2012/wordml" xmlns:w16cex="http://schemas.microsoft.com/office/word/2018/wordml/cex" xmlns:w16cid="http://schemas.microsoft.com/office/word/2016/wordml/cid" xmlns:w16="http://schemas.microsoft.com/office/word/2018/wordml" xmlns:w16sdtdh="http://schemas.microsoft.com/office/word/2020/wordml/sdtdatahash" xmlns:w16se="http://schemas.microsoft.com/office/word/2015/wordml/symex" xmlns:wpg="http://schemas.microsoft.com/office/word/2010/wordprocessingGroup" xmlns:wpi="http://schemas.microsoft.com/office/word/2010/wordprocessingInk" xmlns:wne="http://schemas.microsoft.com/office/word/2006/wordml" xmlns:wps="http://schemas.microsoft.com/office/word/2010/wordprocessingShape" mc:Ignorable="w14 w15 w16se w16cid w16 w16cex w16sdtdh wp14">
+<w:document xmlns:wpc="http://schemas.microsoft.com/office/word/2010/wordprocessingCanvas" xmlns:cx="http://schemas.microsoft.com/office/drawing/2014/chartex" xmlns:cx1="http://schemas.microsoft.com/office/drawing/2015/9/8/chartex" xmlns:cx2="http://schemas.microsoft.com/office/drawing/2015/10/21/chartex" xmlns:cx3="http://schemas.microsoft.com/office/drawing/2016/5/9/chartex" xmlns:cx4="http://schemas.microsoft.com/office/drawing/2016/5/10/chartex" xmlns:cx5="http://schemas.microsoft.com/office/drawing/2016/5/11/chartex" xmlns:cx6="http://schemas.microsoft.com/office/drawing/2016/5/12/chartex" xmlns:cx7="http://schemas.microsoft.com/office/drawing/2016/5/13/chartex" xmlns:cx8="http://schemas.microsoft.com/office/drawing/2016/5/14/chartex" xmlns:mc="http://schemas.openxmlformats.org/markup-compatibility/2006" xmlns:aink="http://schemas.microsoft.com/office/drawing/2016/ink" xmlns:am3d="http://schemas.microsoft.com/office/drawing/2017/model3d" xmlns:o="urn:schemas-microsoft-com:office:office" xmlns:r="http://schemas.openxmlformats.org/officeDocument/2006/relationships" xmlns:m="http://schemas.openxmlformats.org/officeDocument/2006/math" xmlns:v="urn:schemas-microsoft-com:vml" xmlns:wp14="http://schemas.microsoft.com/office/word/2010/wordprocessingDrawing" xmlns:wp="http://schemas.openxmlformats.org/drawingml/2006/wordprocessingDrawing" xmlns:w10="urn:schemas-microsoft-com:office:word" xmlns:w="http://schemas.openxmlformats.org/wordprocessingml/2006/main" xmlns:w14="http://schemas.microsoft.com/office/word/2010/wordml" xmlns:w15="http://schemas.microsoft.com/office/word/2012/wordml" xmlns:w16cex="http://schemas.microsoft.com/office/word/2018/wordml/cex" xmlns:w16cid="http://schemas.microsoft.com/office/word/2016/wordml/cid" xmlns:w16="http://schemas.microsoft.com/office/word/2018/wordml" xmlns:w16se="http://schemas.microsoft.com/office/word/2015/wordml/symex" xmlns:wpg="http://schemas.microsoft.com/office/word/2010/wordprocessingGroup" xmlns:wpi="http://schemas.microsoft.com/office/word/2010/wordprocessingInk" xmlns:wne="http://schemas.microsoft.com/office/word/2006/wordml" xmlns:wps="http://schemas.microsoft.com/office/word/2010/wordprocessingShape" mc:Ignorable="w14 w15 w16se w16cid w16 w16cex wp14">
   <w:body>
     <w:p>
       <w:pPr>
@@ -12,7 +12,6 @@
           <w:lang w:val="pt-BR"/>
         </w:rPr>
       </w:pPr>
-      <w:proofErr w:type="spellStart"/>
       <w:r>
         <w:rPr>
           <w:rFonts w:ascii="Times New Roman" w:hAnsi="Times New Roman"/>
@@ -20,7 +19,6 @@
         </w:rPr>
         <w:t>DeliFit</w:t>
       </w:r>
-      <w:proofErr w:type="spellEnd"/>
     </w:p>
     <w:p>
       <w:pPr>
@@ -2008,14 +2006,12 @@
         </w:rPr>
         <w:t xml:space="preserve">Esse documento provê uma visão de alto nível dos objetivos da arquitetura, dos estilos arquiteturais e componentes que foram selecionados para implementação das funcionalidades propostas pelos casos de usos levantados do </w:t>
       </w:r>
-      <w:proofErr w:type="spellStart"/>
       <w:r>
         <w:rPr>
           <w:color w:val="000000"/>
         </w:rPr>
         <w:t>DeliFit</w:t>
       </w:r>
-      <w:proofErr w:type="spellEnd"/>
       <w:r>
         <w:rPr>
           <w:color w:val="000000"/>
@@ -2067,7 +2063,6 @@
         </w:rPr>
         <w:t xml:space="preserve">Este documento oferece uma visão geral arquitetural do sistema </w:t>
       </w:r>
-      <w:proofErr w:type="spellStart"/>
       <w:r>
         <w:rPr>
           <w:sz w:val="24"/>
@@ -2075,7 +2070,6 @@
         </w:rPr>
         <w:t>DeliFit</w:t>
       </w:r>
-      <w:proofErr w:type="spellEnd"/>
       <w:r>
         <w:rPr>
           <w:sz w:val="24"/>
@@ -2128,7 +2122,6 @@
         </w:rPr>
         <w:t xml:space="preserve">Este Documento de Arquitetura de Software é aplicado ao Sistema </w:t>
       </w:r>
-      <w:proofErr w:type="spellStart"/>
       <w:r>
         <w:rPr>
           <w:sz w:val="24"/>
@@ -2136,7 +2129,6 @@
         </w:rPr>
         <w:t>DeliFit</w:t>
       </w:r>
-      <w:proofErr w:type="spellEnd"/>
       <w:r>
         <w:rPr>
           <w:sz w:val="24"/>
@@ -2149,23 +2141,7 @@
           <w:sz w:val="24"/>
           <w:szCs w:val="24"/>
         </w:rPr>
-        <w:t xml:space="preserve">Paulo Henrique, </w:t>
-      </w:r>
-      <w:proofErr w:type="spellStart"/>
-      <w:r>
-        <w:rPr>
-          <w:sz w:val="24"/>
-          <w:szCs w:val="24"/>
-        </w:rPr>
-        <w:t>Kauan</w:t>
-      </w:r>
-      <w:proofErr w:type="spellEnd"/>
-      <w:r>
-        <w:rPr>
-          <w:sz w:val="24"/>
-          <w:szCs w:val="24"/>
-        </w:rPr>
-        <w:t xml:space="preserve"> Felipe, Matheus Calixto e Leandro Carvalho</w:t>
+        <w:t>Paulo Henrique, Kauan Felipe, Matheus Calixto e Leandro Carvalho</w:t>
       </w:r>
       <w:r>
         <w:rPr>
@@ -2385,7 +2361,6 @@
           <w:lang w:val="pt-BR"/>
         </w:rPr>
       </w:pPr>
-      <w:proofErr w:type="spellStart"/>
       <w:r>
         <w:rPr>
           <w:i/>
@@ -2395,7 +2370,6 @@
         </w:rPr>
         <w:t>RationalUnifiedProcess</w:t>
       </w:r>
-      <w:proofErr w:type="spellEnd"/>
     </w:p>
     <w:p>
       <w:pPr>
@@ -2710,41 +2684,15 @@
           <w:sz w:val="24"/>
           <w:szCs w:val="24"/>
         </w:rPr>
-        <w:t xml:space="preserve">Este documento apresenta a arquitetura como uma série de visualizações, mencionadas acima. Essas visões são apresentadas como Modelos do </w:t>
-      </w:r>
-      <w:proofErr w:type="spellStart"/>
-      <w:r>
-        <w:rPr>
-          <w:sz w:val="24"/>
-          <w:szCs w:val="24"/>
-        </w:rPr>
-        <w:t>StarUML</w:t>
-      </w:r>
-      <w:proofErr w:type="spellEnd"/>
-      <w:r>
-        <w:rPr>
-          <w:sz w:val="24"/>
-          <w:szCs w:val="24"/>
-        </w:rPr>
-        <w:t xml:space="preserve"> e utiliza a Linguagem Unificada de Modelagem (UML – </w:t>
-      </w:r>
-      <w:proofErr w:type="spellStart"/>
+        <w:t xml:space="preserve">Este documento apresenta a arquitetura como uma série de visualizações, mencionadas acima. Essas visões são apresentadas como Modelos do StarUML e utiliza a Linguagem Unificada de Modelagem (UML – </w:t>
+      </w:r>
       <w:r>
         <w:rPr>
           <w:i/>
           <w:sz w:val="24"/>
           <w:szCs w:val="24"/>
         </w:rPr>
-        <w:t>UnifiedModelingLanguage</w:t>
-      </w:r>
-      <w:proofErr w:type="spellEnd"/>
-      <w:r>
-        <w:rPr>
-          <w:i/>
-          <w:sz w:val="24"/>
-          <w:szCs w:val="24"/>
-        </w:rPr>
-        <w:t>).</w:t>
+        <w:t>UnifiedModelingLanguage).</w:t>
       </w:r>
     </w:p>
     <w:p>
@@ -2865,7 +2813,6 @@
         </w:rPr>
         <w:t xml:space="preserve">A versão Mobile do </w:t>
       </w:r>
-      <w:proofErr w:type="spellStart"/>
       <w:r>
         <w:rPr>
           <w:sz w:val="24"/>
@@ -2873,7 +2820,6 @@
         </w:rPr>
         <w:t>DeliFit</w:t>
       </w:r>
-      <w:proofErr w:type="spellEnd"/>
       <w:r>
         <w:rPr>
           <w:sz w:val="24"/>
@@ -3791,7 +3737,6 @@
         </w:rPr>
         <w:t xml:space="preserve">A visão lógica do </w:t>
       </w:r>
-      <w:proofErr w:type="spellStart"/>
       <w:r>
         <w:rPr>
           <w:sz w:val="24"/>
@@ -3799,7 +3744,6 @@
         </w:rPr>
         <w:t>DeliFit</w:t>
       </w:r>
-      <w:proofErr w:type="spellEnd"/>
       <w:r>
         <w:rPr>
           <w:sz w:val="24"/>
@@ -3878,7 +3822,6 @@
           <w:lang w:val="pt-BR"/>
         </w:rPr>
       </w:pPr>
-      <w:proofErr w:type="spellStart"/>
       <w:r>
         <w:rPr>
           <w:iCs/>
@@ -3895,9 +3838,8 @@
           <w:szCs w:val="24"/>
           <w:lang w:val="pt-BR"/>
         </w:rPr>
-        <w:t>Web</w:t>
-      </w:r>
-      <w:proofErr w:type="spellEnd"/>
+        <w:t xml:space="preserve">Web: Nesses pacotes são armazenados os componentes que fazem parte da interface gráfica da aplicação, as Controladoras e as ViewModels do </w:t>
+      </w:r>
       <w:r>
         <w:rPr>
           <w:iCs/>
@@ -3905,39 +3847,8 @@
           <w:szCs w:val="24"/>
           <w:lang w:val="pt-BR"/>
         </w:rPr>
-        <w:t xml:space="preserve">: Nesses pacotes são armazenados os componentes que fazem parte da interface gráfica da aplicação, as Controladoras e as </w:t>
-      </w:r>
-      <w:proofErr w:type="spellStart"/>
-      <w:r>
-        <w:rPr>
-          <w:iCs/>
-          <w:sz w:val="24"/>
-          <w:szCs w:val="24"/>
-          <w:lang w:val="pt-BR"/>
-        </w:rPr>
-        <w:t>ViewModels</w:t>
-      </w:r>
-      <w:proofErr w:type="spellEnd"/>
-      <w:r>
-        <w:rPr>
-          <w:iCs/>
-          <w:sz w:val="24"/>
-          <w:szCs w:val="24"/>
-          <w:lang w:val="pt-BR"/>
-        </w:rPr>
-        <w:t xml:space="preserve"> do </w:t>
-      </w:r>
-      <w:proofErr w:type="spellStart"/>
-      <w:r>
-        <w:rPr>
-          <w:iCs/>
-          <w:sz w:val="24"/>
-          <w:szCs w:val="24"/>
-          <w:lang w:val="pt-BR"/>
-        </w:rPr>
         <w:t>DeliFit</w:t>
       </w:r>
-      <w:proofErr w:type="spellEnd"/>
       <w:r>
         <w:rPr>
           <w:iCs/>
@@ -4020,6 +3931,7 @@
       </w:pPr>
       <w:r>
         <w:rPr>
+          <w:noProof/>
           <w:sz w:val="24"/>
           <w:szCs w:val="24"/>
         </w:rPr>
@@ -4254,15 +4166,11 @@
         <w:jc w:val="center"/>
       </w:pPr>
       <w:r>
-        <w:rPr>
-          <w:noProof/>
-          <w:lang w:val="pt-BR" w:eastAsia="pt-BR"/>
-        </w:rPr>
         <w:drawing>
-          <wp:inline distT="0" distB="0" distL="0" distR="0" wp14:anchorId="5D61B039" wp14:editId="07B250A7">
-            <wp:extent cx="5496692" cy="5096586"/>
-            <wp:effectExtent l="0" t="0" r="8890" b="8890"/>
-            <wp:docPr id="7" name="Imagem 7"/>
+          <wp:inline distT="0" distB="0" distL="0" distR="0" wp14:anchorId="003B2092" wp14:editId="775D2C1F">
+            <wp:extent cx="4753638" cy="4505954"/>
+            <wp:effectExtent l="0" t="0" r="0" b="9525"/>
+            <wp:docPr id="2" name="Imagem 2"/>
             <wp:cNvGraphicFramePr>
               <a:graphicFrameLocks xmlns:a="http://schemas.openxmlformats.org/drawingml/2006/main" noChangeAspect="1"/>
             </wp:cNvGraphicFramePr>
@@ -4282,7 +4190,7 @@
                   <pic:spPr>
                     <a:xfrm>
                       <a:off x="0" y="0"/>
-                      <a:ext cx="5496692" cy="5096586"/>
+                      <a:ext cx="4753638" cy="4505954"/>
                     </a:xfrm>
                     <a:prstGeom prst="rect">
                       <a:avLst/>
@@ -4294,6 +4202,8 @@
           </wp:inline>
         </w:drawing>
       </w:r>
+      <w:bookmarkStart w:id="35" w:name="_GoBack"/>
+      <w:bookmarkEnd w:id="35"/>
     </w:p>
     <w:p>
       <w:pPr>
@@ -4403,7 +4313,7 @@
         <w:ind w:left="360" w:hanging="360"/>
         <w:jc w:val="both"/>
       </w:pPr>
-      <w:bookmarkStart w:id="35" w:name="_Toc216458504"/>
+      <w:bookmarkStart w:id="36" w:name="_Toc216458504"/>
       <w:r>
         <w:rPr>
           <w:rFonts w:ascii="Times New Roman" w:hAnsi="Times New Roman"/>
@@ -4411,7 +4321,7 @@
         </w:rPr>
         <w:t>Visão de Implementação</w:t>
       </w:r>
-      <w:bookmarkEnd w:id="35"/>
+      <w:bookmarkEnd w:id="36"/>
     </w:p>
     <w:p>
       <w:pPr>
@@ -4517,8 +4427,8 @@
         <w:ind w:left="360" w:hanging="360"/>
         <w:jc w:val="both"/>
       </w:pPr>
-      <w:bookmarkStart w:id="36" w:name="_Toc18206193"/>
       <w:bookmarkStart w:id="37" w:name="_Toc216458505"/>
+      <w:bookmarkStart w:id="38" w:name="_Toc18206193"/>
       <w:r>
         <w:rPr>
           <w:rFonts w:ascii="Times New Roman" w:hAnsi="Times New Roman"/>
@@ -4535,7 +4445,7 @@
         </w:rPr>
         <w:t xml:space="preserve"> </w:t>
       </w:r>
-      <w:bookmarkEnd w:id="36"/>
+      <w:bookmarkEnd w:id="38"/>
     </w:p>
     <w:p>
       <w:pPr>
@@ -4550,6 +4460,7 @@
       </w:pPr>
       <w:r>
         <w:rPr>
+          <w:noProof/>
           <w:sz w:val="24"/>
           <w:szCs w:val="24"/>
           <w:lang w:val="pt-BR"/>
@@ -4635,8 +4546,8 @@
           <w:lang w:val="pt-BR"/>
         </w:rPr>
       </w:pPr>
-      <w:bookmarkStart w:id="38" w:name="_Toc18206194"/>
-      <w:bookmarkStart w:id="39" w:name="_Toc216458506"/>
+      <w:bookmarkStart w:id="39" w:name="_Toc18206194"/>
+      <w:bookmarkStart w:id="40" w:name="_Toc216458506"/>
       <w:r>
         <w:rPr>
           <w:rFonts w:ascii="Times New Roman" w:hAnsi="Times New Roman"/>
@@ -4644,7 +4555,7 @@
         </w:rPr>
         <w:t xml:space="preserve">Tamanho e </w:t>
       </w:r>
-      <w:bookmarkEnd w:id="38"/>
+      <w:bookmarkEnd w:id="39"/>
       <w:r>
         <w:rPr>
           <w:rFonts w:ascii="Times New Roman" w:hAnsi="Times New Roman"/>
@@ -4652,7 +4563,7 @@
         </w:rPr>
         <w:t>Performance</w:t>
       </w:r>
-      <w:bookmarkEnd w:id="39"/>
+      <w:bookmarkEnd w:id="40"/>
     </w:p>
     <w:p>
       <w:pPr>
@@ -4681,8 +4592,8 @@
           <w:lang w:val="pt-BR"/>
         </w:rPr>
       </w:pPr>
-      <w:bookmarkStart w:id="40" w:name="_Toc18206195"/>
-      <w:bookmarkStart w:id="41" w:name="_Toc216458507"/>
+      <w:bookmarkStart w:id="41" w:name="_Toc18206195"/>
+      <w:bookmarkStart w:id="42" w:name="_Toc216458507"/>
       <w:r>
         <w:rPr>
           <w:rFonts w:ascii="Times New Roman" w:hAnsi="Times New Roman"/>
@@ -4690,8 +4601,8 @@
         </w:rPr>
         <w:t>Qualidade</w:t>
       </w:r>
-      <w:bookmarkEnd w:id="40"/>
       <w:bookmarkEnd w:id="41"/>
+      <w:bookmarkEnd w:id="42"/>
     </w:p>
     <w:p>
       <w:pPr>
@@ -4720,7 +4631,7 @@
           <w:lang w:val="pt-BR"/>
         </w:rPr>
       </w:pPr>
-      <w:bookmarkStart w:id="42" w:name="_Toc216458508"/>
+      <w:bookmarkStart w:id="43" w:name="_Toc216458508"/>
       <w:r>
         <w:rPr>
           <w:rFonts w:ascii="Times New Roman" w:hAnsi="Times New Roman"/>
@@ -4729,7 +4640,7 @@
         <w:lastRenderedPageBreak/>
         <w:t>Exceções</w:t>
       </w:r>
-      <w:bookmarkEnd w:id="42"/>
+      <w:bookmarkEnd w:id="43"/>
     </w:p>
     <w:p>
       <w:pPr>
@@ -4794,23 +4705,7 @@
           <w:szCs w:val="24"/>
           <w:lang w:val="pt-BR"/>
         </w:rPr>
-        <w:t xml:space="preserve">Figura </w:t>
-      </w:r>
-      <w:r>
-        <w:rPr>
-          <w:sz w:val="24"/>
-          <w:szCs w:val="24"/>
-          <w:lang w:val="pt-BR"/>
-        </w:rPr>
-        <w:t>6</w:t>
-      </w:r>
-      <w:r>
-        <w:rPr>
-          <w:sz w:val="24"/>
-          <w:szCs w:val="24"/>
-          <w:lang w:val="pt-BR"/>
-        </w:rPr>
-        <w:t xml:space="preserve"> – Arquitetura de Exceções</w:t>
+        <w:t>Figura 6 – Arquitetura de Exceções</w:t>
       </w:r>
     </w:p>
     <w:p>
@@ -5098,7 +4993,7 @@
 </file>
 
 <file path=word/endnotes.xml><?xml version="1.0" encoding="utf-8"?>
-<w:endnotes xmlns:wpc="http://schemas.microsoft.com/office/word/2010/wordprocessingCanvas" xmlns:cx="http://schemas.microsoft.com/office/drawing/2014/chartex" xmlns:cx1="http://schemas.microsoft.com/office/drawing/2015/9/8/chartex" xmlns:cx2="http://schemas.microsoft.com/office/drawing/2015/10/21/chartex" xmlns:cx3="http://schemas.microsoft.com/office/drawing/2016/5/9/chartex" xmlns:cx4="http://schemas.microsoft.com/office/drawing/2016/5/10/chartex" xmlns:cx5="http://schemas.microsoft.com/office/drawing/2016/5/11/chartex" xmlns:cx6="http://schemas.microsoft.com/office/drawing/2016/5/12/chartex" xmlns:cx7="http://schemas.microsoft.com/office/drawing/2016/5/13/chartex" xmlns:cx8="http://schemas.microsoft.com/office/drawing/2016/5/14/chartex" xmlns:mc="http://schemas.openxmlformats.org/markup-compatibility/2006" xmlns:aink="http://schemas.microsoft.com/office/drawing/2016/ink" xmlns:am3d="http://schemas.microsoft.com/office/drawing/2017/model3d" xmlns:o="urn:schemas-microsoft-com:office:office" xmlns:r="http://schemas.openxmlformats.org/officeDocument/2006/relationships" xmlns:m="http://schemas.openxmlformats.org/officeDocument/2006/math" xmlns:v="urn:schemas-microsoft-com:vml" xmlns:wp14="http://schemas.microsoft.com/office/word/2010/wordprocessingDrawing" xmlns:wp="http://schemas.openxmlformats.org/drawingml/2006/wordprocessingDrawing" xmlns:w10="urn:schemas-microsoft-com:office:word" xmlns:w="http://schemas.openxmlformats.org/wordprocessingml/2006/main" xmlns:w14="http://schemas.microsoft.com/office/word/2010/wordml" xmlns:w15="http://schemas.microsoft.com/office/word/2012/wordml" xmlns:w16cex="http://schemas.microsoft.com/office/word/2018/wordml/cex" xmlns:w16cid="http://schemas.microsoft.com/office/word/2016/wordml/cid" xmlns:w16="http://schemas.microsoft.com/office/word/2018/wordml" xmlns:w16sdtdh="http://schemas.microsoft.com/office/word/2020/wordml/sdtdatahash" xmlns:w16se="http://schemas.microsoft.com/office/word/2015/wordml/symex" xmlns:wpg="http://schemas.microsoft.com/office/word/2010/wordprocessingGroup" xmlns:wpi="http://schemas.microsoft.com/office/word/2010/wordprocessingInk" xmlns:wne="http://schemas.microsoft.com/office/word/2006/wordml" xmlns:wps="http://schemas.microsoft.com/office/word/2010/wordprocessingShape" mc:Ignorable="w14 w15 w16se w16cid w16 w16cex w16sdtdh wp14">
+<w:endnotes xmlns:wpc="http://schemas.microsoft.com/office/word/2010/wordprocessingCanvas" xmlns:cx="http://schemas.microsoft.com/office/drawing/2014/chartex" xmlns:cx1="http://schemas.microsoft.com/office/drawing/2015/9/8/chartex" xmlns:cx2="http://schemas.microsoft.com/office/drawing/2015/10/21/chartex" xmlns:cx3="http://schemas.microsoft.com/office/drawing/2016/5/9/chartex" xmlns:cx4="http://schemas.microsoft.com/office/drawing/2016/5/10/chartex" xmlns:cx5="http://schemas.microsoft.com/office/drawing/2016/5/11/chartex" xmlns:cx6="http://schemas.microsoft.com/office/drawing/2016/5/12/chartex" xmlns:cx7="http://schemas.microsoft.com/office/drawing/2016/5/13/chartex" xmlns:cx8="http://schemas.microsoft.com/office/drawing/2016/5/14/chartex" xmlns:mc="http://schemas.openxmlformats.org/markup-compatibility/2006" xmlns:aink="http://schemas.microsoft.com/office/drawing/2016/ink" xmlns:am3d="http://schemas.microsoft.com/office/drawing/2017/model3d" xmlns:o="urn:schemas-microsoft-com:office:office" xmlns:r="http://schemas.openxmlformats.org/officeDocument/2006/relationships" xmlns:m="http://schemas.openxmlformats.org/officeDocument/2006/math" xmlns:v="urn:schemas-microsoft-com:vml" xmlns:wp14="http://schemas.microsoft.com/office/word/2010/wordprocessingDrawing" xmlns:wp="http://schemas.openxmlformats.org/drawingml/2006/wordprocessingDrawing" xmlns:w10="urn:schemas-microsoft-com:office:word" xmlns:w="http://schemas.openxmlformats.org/wordprocessingml/2006/main" xmlns:w14="http://schemas.microsoft.com/office/word/2010/wordml" xmlns:w15="http://schemas.microsoft.com/office/word/2012/wordml" xmlns:w16cex="http://schemas.microsoft.com/office/word/2018/wordml/cex" xmlns:w16cid="http://schemas.microsoft.com/office/word/2016/wordml/cid" xmlns:w16="http://schemas.microsoft.com/office/word/2018/wordml" xmlns:w16se="http://schemas.microsoft.com/office/word/2015/wordml/symex" xmlns:wpg="http://schemas.microsoft.com/office/word/2010/wordprocessingGroup" xmlns:wpi="http://schemas.microsoft.com/office/word/2010/wordprocessingInk" xmlns:wne="http://schemas.microsoft.com/office/word/2006/wordml" xmlns:wps="http://schemas.microsoft.com/office/word/2010/wordprocessingShape" mc:Ignorable="w14 w15 w16se w16cid w16 w16cex wp14">
   <w:endnote w:type="separator" w:id="-1">
     <w:p>
       <w:pPr>
@@ -5123,7 +5018,7 @@
 </file>
 
 <file path=word/footer1.xml><?xml version="1.0" encoding="utf-8"?>
-<w:ftr xmlns:wpc="http://schemas.microsoft.com/office/word/2010/wordprocessingCanvas" xmlns:cx="http://schemas.microsoft.com/office/drawing/2014/chartex" xmlns:cx1="http://schemas.microsoft.com/office/drawing/2015/9/8/chartex" xmlns:cx2="http://schemas.microsoft.com/office/drawing/2015/10/21/chartex" xmlns:cx3="http://schemas.microsoft.com/office/drawing/2016/5/9/chartex" xmlns:cx4="http://schemas.microsoft.com/office/drawing/2016/5/10/chartex" xmlns:cx5="http://schemas.microsoft.com/office/drawing/2016/5/11/chartex" xmlns:cx6="http://schemas.microsoft.com/office/drawing/2016/5/12/chartex" xmlns:cx7="http://schemas.microsoft.com/office/drawing/2016/5/13/chartex" xmlns:cx8="http://schemas.microsoft.com/office/drawing/2016/5/14/chartex" xmlns:mc="http://schemas.openxmlformats.org/markup-compatibility/2006" xmlns:aink="http://schemas.microsoft.com/office/drawing/2016/ink" xmlns:am3d="http://schemas.microsoft.com/office/drawing/2017/model3d" xmlns:o="urn:schemas-microsoft-com:office:office" xmlns:r="http://schemas.openxmlformats.org/officeDocument/2006/relationships" xmlns:m="http://schemas.openxmlformats.org/officeDocument/2006/math" xmlns:v="urn:schemas-microsoft-com:vml" xmlns:wp14="http://schemas.microsoft.com/office/word/2010/wordprocessingDrawing" xmlns:wp="http://schemas.openxmlformats.org/drawingml/2006/wordprocessingDrawing" xmlns:w10="urn:schemas-microsoft-com:office:word" xmlns:w="http://schemas.openxmlformats.org/wordprocessingml/2006/main" xmlns:w14="http://schemas.microsoft.com/office/word/2010/wordml" xmlns:w15="http://schemas.microsoft.com/office/word/2012/wordml" xmlns:w16cex="http://schemas.microsoft.com/office/word/2018/wordml/cex" xmlns:w16cid="http://schemas.microsoft.com/office/word/2016/wordml/cid" xmlns:w16="http://schemas.microsoft.com/office/word/2018/wordml" xmlns:w16sdtdh="http://schemas.microsoft.com/office/word/2020/wordml/sdtdatahash" xmlns:w16se="http://schemas.microsoft.com/office/word/2015/wordml/symex" xmlns:wpg="http://schemas.microsoft.com/office/word/2010/wordprocessingGroup" xmlns:wpi="http://schemas.microsoft.com/office/word/2010/wordprocessingInk" xmlns:wne="http://schemas.microsoft.com/office/word/2006/wordml" xmlns:wps="http://schemas.microsoft.com/office/word/2010/wordprocessingShape" mc:Ignorable="w14 w15 w16se w16cid w16 w16cex w16sdtdh wp14">
+<w:ftr xmlns:wpc="http://schemas.microsoft.com/office/word/2010/wordprocessingCanvas" xmlns:cx="http://schemas.microsoft.com/office/drawing/2014/chartex" xmlns:cx1="http://schemas.microsoft.com/office/drawing/2015/9/8/chartex" xmlns:cx2="http://schemas.microsoft.com/office/drawing/2015/10/21/chartex" xmlns:cx3="http://schemas.microsoft.com/office/drawing/2016/5/9/chartex" xmlns:cx4="http://schemas.microsoft.com/office/drawing/2016/5/10/chartex" xmlns:cx5="http://schemas.microsoft.com/office/drawing/2016/5/11/chartex" xmlns:cx6="http://schemas.microsoft.com/office/drawing/2016/5/12/chartex" xmlns:cx7="http://schemas.microsoft.com/office/drawing/2016/5/13/chartex" xmlns:cx8="http://schemas.microsoft.com/office/drawing/2016/5/14/chartex" xmlns:mc="http://schemas.openxmlformats.org/markup-compatibility/2006" xmlns:aink="http://schemas.microsoft.com/office/drawing/2016/ink" xmlns:am3d="http://schemas.microsoft.com/office/drawing/2017/model3d" xmlns:o="urn:schemas-microsoft-com:office:office" xmlns:r="http://schemas.openxmlformats.org/officeDocument/2006/relationships" xmlns:m="http://schemas.openxmlformats.org/officeDocument/2006/math" xmlns:v="urn:schemas-microsoft-com:vml" xmlns:wp14="http://schemas.microsoft.com/office/word/2010/wordprocessingDrawing" xmlns:wp="http://schemas.openxmlformats.org/drawingml/2006/wordprocessingDrawing" xmlns:w10="urn:schemas-microsoft-com:office:word" xmlns:w="http://schemas.openxmlformats.org/wordprocessingml/2006/main" xmlns:w14="http://schemas.microsoft.com/office/word/2010/wordml" xmlns:w15="http://schemas.microsoft.com/office/word/2012/wordml" xmlns:w16cex="http://schemas.microsoft.com/office/word/2018/wordml/cex" xmlns:w16cid="http://schemas.microsoft.com/office/word/2016/wordml/cid" xmlns:w16="http://schemas.microsoft.com/office/word/2018/wordml" xmlns:w16se="http://schemas.microsoft.com/office/word/2015/wordml/symex" xmlns:wpg="http://schemas.microsoft.com/office/word/2010/wordprocessingGroup" xmlns:wpi="http://schemas.microsoft.com/office/word/2010/wordprocessingInk" xmlns:wne="http://schemas.microsoft.com/office/word/2006/wordml" xmlns:wps="http://schemas.microsoft.com/office/word/2010/wordprocessingShape" mc:Ignorable="w14 w15 w16se w16cid w16 w16cex wp14">
   <w:tbl>
     <w:tblPr>
       <w:tblW w:w="9486" w:type="dxa"/>
@@ -5157,13 +5052,8 @@
               <w:lang w:val="pt-BR"/>
             </w:rPr>
           </w:pPr>
-          <w:proofErr w:type="spellStart"/>
           <w:r>
-            <w:t>Engenharia</w:t>
-          </w:r>
-          <w:proofErr w:type="spellEnd"/>
-          <w:r>
-            <w:t xml:space="preserve"> de Software</w:t>
+            <w:t>Engenharia de Software</w:t>
           </w:r>
           <w:r>
             <w:rPr>
@@ -5237,23 +5127,7 @@
               <w:rStyle w:val="Nmerodepgina"/>
               <w:lang w:val="pt-BR"/>
             </w:rPr>
-            <w:t xml:space="preserve"> </w:t>
-          </w:r>
-          <w:proofErr w:type="spellStart"/>
-          <w:r>
-            <w:rPr>
-              <w:rStyle w:val="Nmerodepgina"/>
-              <w:lang w:val="pt-BR"/>
-            </w:rPr>
-            <w:t>of</w:t>
-          </w:r>
-          <w:proofErr w:type="spellEnd"/>
-          <w:r>
-            <w:rPr>
-              <w:rStyle w:val="Nmerodepgina"/>
-              <w:lang w:val="pt-BR"/>
-            </w:rPr>
-            <w:t xml:space="preserve"> </w:t>
+            <w:t xml:space="preserve"> of </w:t>
           </w:r>
           <w:r>
             <w:rPr>
@@ -5299,7 +5173,7 @@
 </file>
 
 <file path=word/footnotes.xml><?xml version="1.0" encoding="utf-8"?>
-<w:footnotes xmlns:wpc="http://schemas.microsoft.com/office/word/2010/wordprocessingCanvas" xmlns:cx="http://schemas.microsoft.com/office/drawing/2014/chartex" xmlns:cx1="http://schemas.microsoft.com/office/drawing/2015/9/8/chartex" xmlns:cx2="http://schemas.microsoft.com/office/drawing/2015/10/21/chartex" xmlns:cx3="http://schemas.microsoft.com/office/drawing/2016/5/9/chartex" xmlns:cx4="http://schemas.microsoft.com/office/drawing/2016/5/10/chartex" xmlns:cx5="http://schemas.microsoft.com/office/drawing/2016/5/11/chartex" xmlns:cx6="http://schemas.microsoft.com/office/drawing/2016/5/12/chartex" xmlns:cx7="http://schemas.microsoft.com/office/drawing/2016/5/13/chartex" xmlns:cx8="http://schemas.microsoft.com/office/drawing/2016/5/14/chartex" xmlns:mc="http://schemas.openxmlformats.org/markup-compatibility/2006" xmlns:aink="http://schemas.microsoft.com/office/drawing/2016/ink" xmlns:am3d="http://schemas.microsoft.com/office/drawing/2017/model3d" xmlns:o="urn:schemas-microsoft-com:office:office" xmlns:r="http://schemas.openxmlformats.org/officeDocument/2006/relationships" xmlns:m="http://schemas.openxmlformats.org/officeDocument/2006/math" xmlns:v="urn:schemas-microsoft-com:vml" xmlns:wp14="http://schemas.microsoft.com/office/word/2010/wordprocessingDrawing" xmlns:wp="http://schemas.openxmlformats.org/drawingml/2006/wordprocessingDrawing" xmlns:w10="urn:schemas-microsoft-com:office:word" xmlns:w="http://schemas.openxmlformats.org/wordprocessingml/2006/main" xmlns:w14="http://schemas.microsoft.com/office/word/2010/wordml" xmlns:w15="http://schemas.microsoft.com/office/word/2012/wordml" xmlns:w16cex="http://schemas.microsoft.com/office/word/2018/wordml/cex" xmlns:w16cid="http://schemas.microsoft.com/office/word/2016/wordml/cid" xmlns:w16="http://schemas.microsoft.com/office/word/2018/wordml" xmlns:w16sdtdh="http://schemas.microsoft.com/office/word/2020/wordml/sdtdatahash" xmlns:w16se="http://schemas.microsoft.com/office/word/2015/wordml/symex" xmlns:wpg="http://schemas.microsoft.com/office/word/2010/wordprocessingGroup" xmlns:wpi="http://schemas.microsoft.com/office/word/2010/wordprocessingInk" xmlns:wne="http://schemas.microsoft.com/office/word/2006/wordml" xmlns:wps="http://schemas.microsoft.com/office/word/2010/wordprocessingShape" mc:Ignorable="w14 w15 w16se w16cid w16 w16cex w16sdtdh wp14">
+<w:footnotes xmlns:wpc="http://schemas.microsoft.com/office/word/2010/wordprocessingCanvas" xmlns:cx="http://schemas.microsoft.com/office/drawing/2014/chartex" xmlns:cx1="http://schemas.microsoft.com/office/drawing/2015/9/8/chartex" xmlns:cx2="http://schemas.microsoft.com/office/drawing/2015/10/21/chartex" xmlns:cx3="http://schemas.microsoft.com/office/drawing/2016/5/9/chartex" xmlns:cx4="http://schemas.microsoft.com/office/drawing/2016/5/10/chartex" xmlns:cx5="http://schemas.microsoft.com/office/drawing/2016/5/11/chartex" xmlns:cx6="http://schemas.microsoft.com/office/drawing/2016/5/12/chartex" xmlns:cx7="http://schemas.microsoft.com/office/drawing/2016/5/13/chartex" xmlns:cx8="http://schemas.microsoft.com/office/drawing/2016/5/14/chartex" xmlns:mc="http://schemas.openxmlformats.org/markup-compatibility/2006" xmlns:aink="http://schemas.microsoft.com/office/drawing/2016/ink" xmlns:am3d="http://schemas.microsoft.com/office/drawing/2017/model3d" xmlns:o="urn:schemas-microsoft-com:office:office" xmlns:r="http://schemas.openxmlformats.org/officeDocument/2006/relationships" xmlns:m="http://schemas.openxmlformats.org/officeDocument/2006/math" xmlns:v="urn:schemas-microsoft-com:vml" xmlns:wp14="http://schemas.microsoft.com/office/word/2010/wordprocessingDrawing" xmlns:wp="http://schemas.openxmlformats.org/drawingml/2006/wordprocessingDrawing" xmlns:w10="urn:schemas-microsoft-com:office:word" xmlns:w="http://schemas.openxmlformats.org/wordprocessingml/2006/main" xmlns:w14="http://schemas.microsoft.com/office/word/2010/wordml" xmlns:w15="http://schemas.microsoft.com/office/word/2012/wordml" xmlns:w16cex="http://schemas.microsoft.com/office/word/2018/wordml/cex" xmlns:w16cid="http://schemas.microsoft.com/office/word/2016/wordml/cid" xmlns:w16="http://schemas.microsoft.com/office/word/2018/wordml" xmlns:w16se="http://schemas.microsoft.com/office/word/2015/wordml/symex" xmlns:wpg="http://schemas.microsoft.com/office/word/2010/wordprocessingGroup" xmlns:wpi="http://schemas.microsoft.com/office/word/2010/wordprocessingInk" xmlns:wne="http://schemas.microsoft.com/office/word/2006/wordml" xmlns:wps="http://schemas.microsoft.com/office/word/2010/wordprocessingShape" mc:Ignorable="w14 w15 w16se w16cid w16 w16cex wp14">
   <w:footnote w:type="separator" w:id="-1">
     <w:p>
       <w:pPr>
@@ -5324,7 +5198,7 @@
 </file>
 
 <file path=word/header1.xml><?xml version="1.0" encoding="utf-8"?>
-<w:hdr xmlns:wpc="http://schemas.microsoft.com/office/word/2010/wordprocessingCanvas" xmlns:cx="http://schemas.microsoft.com/office/drawing/2014/chartex" xmlns:cx1="http://schemas.microsoft.com/office/drawing/2015/9/8/chartex" xmlns:cx2="http://schemas.microsoft.com/office/drawing/2015/10/21/chartex" xmlns:cx3="http://schemas.microsoft.com/office/drawing/2016/5/9/chartex" xmlns:cx4="http://schemas.microsoft.com/office/drawing/2016/5/10/chartex" xmlns:cx5="http://schemas.microsoft.com/office/drawing/2016/5/11/chartex" xmlns:cx6="http://schemas.microsoft.com/office/drawing/2016/5/12/chartex" xmlns:cx7="http://schemas.microsoft.com/office/drawing/2016/5/13/chartex" xmlns:cx8="http://schemas.microsoft.com/office/drawing/2016/5/14/chartex" xmlns:mc="http://schemas.openxmlformats.org/markup-compatibility/2006" xmlns:aink="http://schemas.microsoft.com/office/drawing/2016/ink" xmlns:am3d="http://schemas.microsoft.com/office/drawing/2017/model3d" xmlns:o="urn:schemas-microsoft-com:office:office" xmlns:r="http://schemas.openxmlformats.org/officeDocument/2006/relationships" xmlns:m="http://schemas.openxmlformats.org/officeDocument/2006/math" xmlns:v="urn:schemas-microsoft-com:vml" xmlns:wp14="http://schemas.microsoft.com/office/word/2010/wordprocessingDrawing" xmlns:wp="http://schemas.openxmlformats.org/drawingml/2006/wordprocessingDrawing" xmlns:w10="urn:schemas-microsoft-com:office:word" xmlns:w="http://schemas.openxmlformats.org/wordprocessingml/2006/main" xmlns:w14="http://schemas.microsoft.com/office/word/2010/wordml" xmlns:w15="http://schemas.microsoft.com/office/word/2012/wordml" xmlns:w16cex="http://schemas.microsoft.com/office/word/2018/wordml/cex" xmlns:w16cid="http://schemas.microsoft.com/office/word/2016/wordml/cid" xmlns:w16="http://schemas.microsoft.com/office/word/2018/wordml" xmlns:w16sdtdh="http://schemas.microsoft.com/office/word/2020/wordml/sdtdatahash" xmlns:w16se="http://schemas.microsoft.com/office/word/2015/wordml/symex" xmlns:wpg="http://schemas.microsoft.com/office/word/2010/wordprocessingGroup" xmlns:wpi="http://schemas.microsoft.com/office/word/2010/wordprocessingInk" xmlns:wne="http://schemas.microsoft.com/office/word/2006/wordml" xmlns:wps="http://schemas.microsoft.com/office/word/2010/wordprocessingShape" mc:Ignorable="w14 w15 w16se w16cid w16 w16cex w16sdtdh wp14">
+<w:hdr xmlns:wpc="http://schemas.microsoft.com/office/word/2010/wordprocessingCanvas" xmlns:cx="http://schemas.microsoft.com/office/drawing/2014/chartex" xmlns:cx1="http://schemas.microsoft.com/office/drawing/2015/9/8/chartex" xmlns:cx2="http://schemas.microsoft.com/office/drawing/2015/10/21/chartex" xmlns:cx3="http://schemas.microsoft.com/office/drawing/2016/5/9/chartex" xmlns:cx4="http://schemas.microsoft.com/office/drawing/2016/5/10/chartex" xmlns:cx5="http://schemas.microsoft.com/office/drawing/2016/5/11/chartex" xmlns:cx6="http://schemas.microsoft.com/office/drawing/2016/5/12/chartex" xmlns:cx7="http://schemas.microsoft.com/office/drawing/2016/5/13/chartex" xmlns:cx8="http://schemas.microsoft.com/office/drawing/2016/5/14/chartex" xmlns:mc="http://schemas.openxmlformats.org/markup-compatibility/2006" xmlns:aink="http://schemas.microsoft.com/office/drawing/2016/ink" xmlns:am3d="http://schemas.microsoft.com/office/drawing/2017/model3d" xmlns:o="urn:schemas-microsoft-com:office:office" xmlns:r="http://schemas.openxmlformats.org/officeDocument/2006/relationships" xmlns:m="http://schemas.openxmlformats.org/officeDocument/2006/math" xmlns:v="urn:schemas-microsoft-com:vml" xmlns:wp14="http://schemas.microsoft.com/office/word/2010/wordprocessingDrawing" xmlns:wp="http://schemas.openxmlformats.org/drawingml/2006/wordprocessingDrawing" xmlns:w10="urn:schemas-microsoft-com:office:word" xmlns:w="http://schemas.openxmlformats.org/wordprocessingml/2006/main" xmlns:w14="http://schemas.microsoft.com/office/word/2010/wordml" xmlns:w15="http://schemas.microsoft.com/office/word/2012/wordml" xmlns:w16cex="http://schemas.microsoft.com/office/word/2018/wordml/cex" xmlns:w16cid="http://schemas.microsoft.com/office/word/2016/wordml/cid" xmlns:w16="http://schemas.microsoft.com/office/word/2018/wordml" xmlns:w16se="http://schemas.microsoft.com/office/word/2015/wordml/symex" xmlns:wpg="http://schemas.microsoft.com/office/word/2010/wordprocessingGroup" xmlns:wpi="http://schemas.microsoft.com/office/word/2010/wordprocessingInk" xmlns:wne="http://schemas.microsoft.com/office/word/2006/wordml" xmlns:wps="http://schemas.microsoft.com/office/word/2010/wordprocessingShape" mc:Ignorable="w14 w15 w16se w16cid w16 w16cex wp14">
   <w:p>
     <w:pPr>
       <w:rPr>
@@ -5357,7 +5231,6 @@
         <w:szCs w:val="36"/>
       </w:rPr>
     </w:pPr>
-    <w:proofErr w:type="spellStart"/>
     <w:r>
       <w:rPr>
         <w:b/>
@@ -5365,17 +5238,7 @@
         <w:sz w:val="36"/>
         <w:szCs w:val="36"/>
       </w:rPr>
-      <w:t>Engenharia</w:t>
-    </w:r>
-    <w:proofErr w:type="spellEnd"/>
-    <w:r>
-      <w:rPr>
-        <w:b/>
-        <w:bCs/>
-        <w:sz w:val="36"/>
-        <w:szCs w:val="36"/>
-      </w:rPr>
-      <w:t xml:space="preserve"> de Software 2</w:t>
+      <w:t>Engenharia de Software 2</w:t>
     </w:r>
   </w:p>
   <w:p>
@@ -5399,7 +5262,7 @@
 </file>
 
 <file path=word/header2.xml><?xml version="1.0" encoding="utf-8"?>
-<w:hdr xmlns:wpc="http://schemas.microsoft.com/office/word/2010/wordprocessingCanvas" xmlns:cx="http://schemas.microsoft.com/office/drawing/2014/chartex" xmlns:cx1="http://schemas.microsoft.com/office/drawing/2015/9/8/chartex" xmlns:cx2="http://schemas.microsoft.com/office/drawing/2015/10/21/chartex" xmlns:cx3="http://schemas.microsoft.com/office/drawing/2016/5/9/chartex" xmlns:cx4="http://schemas.microsoft.com/office/drawing/2016/5/10/chartex" xmlns:cx5="http://schemas.microsoft.com/office/drawing/2016/5/11/chartex" xmlns:cx6="http://schemas.microsoft.com/office/drawing/2016/5/12/chartex" xmlns:cx7="http://schemas.microsoft.com/office/drawing/2016/5/13/chartex" xmlns:cx8="http://schemas.microsoft.com/office/drawing/2016/5/14/chartex" xmlns:mc="http://schemas.openxmlformats.org/markup-compatibility/2006" xmlns:aink="http://schemas.microsoft.com/office/drawing/2016/ink" xmlns:am3d="http://schemas.microsoft.com/office/drawing/2017/model3d" xmlns:o="urn:schemas-microsoft-com:office:office" xmlns:r="http://schemas.openxmlformats.org/officeDocument/2006/relationships" xmlns:m="http://schemas.openxmlformats.org/officeDocument/2006/math" xmlns:v="urn:schemas-microsoft-com:vml" xmlns:wp14="http://schemas.microsoft.com/office/word/2010/wordprocessingDrawing" xmlns:wp="http://schemas.openxmlformats.org/drawingml/2006/wordprocessingDrawing" xmlns:w10="urn:schemas-microsoft-com:office:word" xmlns:w="http://schemas.openxmlformats.org/wordprocessingml/2006/main" xmlns:w14="http://schemas.microsoft.com/office/word/2010/wordml" xmlns:w15="http://schemas.microsoft.com/office/word/2012/wordml" xmlns:w16cex="http://schemas.microsoft.com/office/word/2018/wordml/cex" xmlns:w16cid="http://schemas.microsoft.com/office/word/2016/wordml/cid" xmlns:w16="http://schemas.microsoft.com/office/word/2018/wordml" xmlns:w16sdtdh="http://schemas.microsoft.com/office/word/2020/wordml/sdtdatahash" xmlns:w16se="http://schemas.microsoft.com/office/word/2015/wordml/symex" xmlns:wpg="http://schemas.microsoft.com/office/word/2010/wordprocessingGroup" xmlns:wpi="http://schemas.microsoft.com/office/word/2010/wordprocessingInk" xmlns:wne="http://schemas.microsoft.com/office/word/2006/wordml" xmlns:wps="http://schemas.microsoft.com/office/word/2010/wordprocessingShape" mc:Ignorable="w14 w15 w16se w16cid w16 w16cex w16sdtdh wp14">
+<w:hdr xmlns:wpc="http://schemas.microsoft.com/office/word/2010/wordprocessingCanvas" xmlns:cx="http://schemas.microsoft.com/office/drawing/2014/chartex" xmlns:cx1="http://schemas.microsoft.com/office/drawing/2015/9/8/chartex" xmlns:cx2="http://schemas.microsoft.com/office/drawing/2015/10/21/chartex" xmlns:cx3="http://schemas.microsoft.com/office/drawing/2016/5/9/chartex" xmlns:cx4="http://schemas.microsoft.com/office/drawing/2016/5/10/chartex" xmlns:cx5="http://schemas.microsoft.com/office/drawing/2016/5/11/chartex" xmlns:cx6="http://schemas.microsoft.com/office/drawing/2016/5/12/chartex" xmlns:cx7="http://schemas.microsoft.com/office/drawing/2016/5/13/chartex" xmlns:cx8="http://schemas.microsoft.com/office/drawing/2016/5/14/chartex" xmlns:mc="http://schemas.openxmlformats.org/markup-compatibility/2006" xmlns:aink="http://schemas.microsoft.com/office/drawing/2016/ink" xmlns:am3d="http://schemas.microsoft.com/office/drawing/2017/model3d" xmlns:o="urn:schemas-microsoft-com:office:office" xmlns:r="http://schemas.openxmlformats.org/officeDocument/2006/relationships" xmlns:m="http://schemas.openxmlformats.org/officeDocument/2006/math" xmlns:v="urn:schemas-microsoft-com:vml" xmlns:wp14="http://schemas.microsoft.com/office/word/2010/wordprocessingDrawing" xmlns:wp="http://schemas.openxmlformats.org/drawingml/2006/wordprocessingDrawing" xmlns:w10="urn:schemas-microsoft-com:office:word" xmlns:w="http://schemas.openxmlformats.org/wordprocessingml/2006/main" xmlns:w14="http://schemas.microsoft.com/office/word/2010/wordml" xmlns:w15="http://schemas.microsoft.com/office/word/2012/wordml" xmlns:w16cex="http://schemas.microsoft.com/office/word/2018/wordml/cex" xmlns:w16cid="http://schemas.microsoft.com/office/word/2016/wordml/cid" xmlns:w16="http://schemas.microsoft.com/office/word/2018/wordml" xmlns:w16se="http://schemas.microsoft.com/office/word/2015/wordml/symex" xmlns:wpg="http://schemas.microsoft.com/office/word/2010/wordprocessingGroup" xmlns:wpi="http://schemas.microsoft.com/office/word/2010/wordprocessingInk" xmlns:wne="http://schemas.microsoft.com/office/word/2006/wordml" xmlns:wps="http://schemas.microsoft.com/office/word/2010/wordprocessingShape" mc:Ignorable="w14 w15 w16se w16cid w16 w16cex wp14">
   <w:tbl>
     <w:tblPr>
       <w:tblW w:w="9558" w:type="dxa"/>
@@ -5427,14 +5290,12 @@
               <w:lang w:val="pt-BR"/>
             </w:rPr>
           </w:pPr>
-          <w:proofErr w:type="spellStart"/>
           <w:r>
             <w:rPr>
               <w:lang w:val="pt-BR"/>
             </w:rPr>
             <w:t>DeliFit</w:t>
           </w:r>
-          <w:proofErr w:type="spellEnd"/>
         </w:p>
       </w:tc>
       <w:tc>
@@ -5555,13 +5416,13 @@
 </file>
 
 <file path=word/header3.xml><?xml version="1.0" encoding="utf-8"?>
-<w:hdr xmlns:wpc="http://schemas.microsoft.com/office/word/2010/wordprocessingCanvas" xmlns:cx="http://schemas.microsoft.com/office/drawing/2014/chartex" xmlns:cx1="http://schemas.microsoft.com/office/drawing/2015/9/8/chartex" xmlns:cx2="http://schemas.microsoft.com/office/drawing/2015/10/21/chartex" xmlns:cx3="http://schemas.microsoft.com/office/drawing/2016/5/9/chartex" xmlns:cx4="http://schemas.microsoft.com/office/drawing/2016/5/10/chartex" xmlns:cx5="http://schemas.microsoft.com/office/drawing/2016/5/11/chartex" xmlns:cx6="http://schemas.microsoft.com/office/drawing/2016/5/12/chartex" xmlns:cx7="http://schemas.microsoft.com/office/drawing/2016/5/13/chartex" xmlns:cx8="http://schemas.microsoft.com/office/drawing/2016/5/14/chartex" xmlns:mc="http://schemas.openxmlformats.org/markup-compatibility/2006" xmlns:aink="http://schemas.microsoft.com/office/drawing/2016/ink" xmlns:am3d="http://schemas.microsoft.com/office/drawing/2017/model3d" xmlns:o="urn:schemas-microsoft-com:office:office" xmlns:r="http://schemas.openxmlformats.org/officeDocument/2006/relationships" xmlns:m="http://schemas.openxmlformats.org/officeDocument/2006/math" xmlns:v="urn:schemas-microsoft-com:vml" xmlns:wp14="http://schemas.microsoft.com/office/word/2010/wordprocessingDrawing" xmlns:wp="http://schemas.openxmlformats.org/drawingml/2006/wordprocessingDrawing" xmlns:w10="urn:schemas-microsoft-com:office:word" xmlns:w="http://schemas.openxmlformats.org/wordprocessingml/2006/main" xmlns:w14="http://schemas.microsoft.com/office/word/2010/wordml" xmlns:w15="http://schemas.microsoft.com/office/word/2012/wordml" xmlns:w16cex="http://schemas.microsoft.com/office/word/2018/wordml/cex" xmlns:w16cid="http://schemas.microsoft.com/office/word/2016/wordml/cid" xmlns:w16="http://schemas.microsoft.com/office/word/2018/wordml" xmlns:w16sdtdh="http://schemas.microsoft.com/office/word/2020/wordml/sdtdatahash" xmlns:w16se="http://schemas.microsoft.com/office/word/2015/wordml/symex" xmlns:wpg="http://schemas.microsoft.com/office/word/2010/wordprocessingGroup" xmlns:wpi="http://schemas.microsoft.com/office/word/2010/wordprocessingInk" xmlns:wne="http://schemas.microsoft.com/office/word/2006/wordml" xmlns:wps="http://schemas.microsoft.com/office/word/2010/wordprocessingShape" mc:Ignorable="w14 w15 w16se w16cid w16 w16cex w16sdtdh wp14">
+<w:hdr xmlns:wpc="http://schemas.microsoft.com/office/word/2010/wordprocessingCanvas" xmlns:cx="http://schemas.microsoft.com/office/drawing/2014/chartex" xmlns:cx1="http://schemas.microsoft.com/office/drawing/2015/9/8/chartex" xmlns:cx2="http://schemas.microsoft.com/office/drawing/2015/10/21/chartex" xmlns:cx3="http://schemas.microsoft.com/office/drawing/2016/5/9/chartex" xmlns:cx4="http://schemas.microsoft.com/office/drawing/2016/5/10/chartex" xmlns:cx5="http://schemas.microsoft.com/office/drawing/2016/5/11/chartex" xmlns:cx6="http://schemas.microsoft.com/office/drawing/2016/5/12/chartex" xmlns:cx7="http://schemas.microsoft.com/office/drawing/2016/5/13/chartex" xmlns:cx8="http://schemas.microsoft.com/office/drawing/2016/5/14/chartex" xmlns:mc="http://schemas.openxmlformats.org/markup-compatibility/2006" xmlns:aink="http://schemas.microsoft.com/office/drawing/2016/ink" xmlns:am3d="http://schemas.microsoft.com/office/drawing/2017/model3d" xmlns:o="urn:schemas-microsoft-com:office:office" xmlns:r="http://schemas.openxmlformats.org/officeDocument/2006/relationships" xmlns:m="http://schemas.openxmlformats.org/officeDocument/2006/math" xmlns:v="urn:schemas-microsoft-com:vml" xmlns:wp14="http://schemas.microsoft.com/office/word/2010/wordprocessingDrawing" xmlns:wp="http://schemas.openxmlformats.org/drawingml/2006/wordprocessingDrawing" xmlns:w10="urn:schemas-microsoft-com:office:word" xmlns:w="http://schemas.openxmlformats.org/wordprocessingml/2006/main" xmlns:w14="http://schemas.microsoft.com/office/word/2010/wordml" xmlns:w15="http://schemas.microsoft.com/office/word/2012/wordml" xmlns:w16cex="http://schemas.microsoft.com/office/word/2018/wordml/cex" xmlns:w16cid="http://schemas.microsoft.com/office/word/2016/wordml/cid" xmlns:w16="http://schemas.microsoft.com/office/word/2018/wordml" xmlns:w16se="http://schemas.microsoft.com/office/word/2015/wordml/symex" xmlns:wpg="http://schemas.microsoft.com/office/word/2010/wordprocessingGroup" xmlns:wpi="http://schemas.microsoft.com/office/word/2010/wordprocessingInk" xmlns:wne="http://schemas.microsoft.com/office/word/2006/wordml" xmlns:wps="http://schemas.microsoft.com/office/word/2010/wordprocessingShape" mc:Ignorable="w14 w15 w16se w16cid w16 w16cex wp14">
   <w:p/>
 </w:hdr>
 </file>
 
 <file path=word/numbering.xml><?xml version="1.0" encoding="utf-8"?>
-<w:numbering xmlns:wpc="http://schemas.microsoft.com/office/word/2010/wordprocessingCanvas" xmlns:cx="http://schemas.microsoft.com/office/drawing/2014/chartex" xmlns:cx1="http://schemas.microsoft.com/office/drawing/2015/9/8/chartex" xmlns:cx2="http://schemas.microsoft.com/office/drawing/2015/10/21/chartex" xmlns:cx3="http://schemas.microsoft.com/office/drawing/2016/5/9/chartex" xmlns:cx4="http://schemas.microsoft.com/office/drawing/2016/5/10/chartex" xmlns:cx5="http://schemas.microsoft.com/office/drawing/2016/5/11/chartex" xmlns:cx6="http://schemas.microsoft.com/office/drawing/2016/5/12/chartex" xmlns:cx7="http://schemas.microsoft.com/office/drawing/2016/5/13/chartex" xmlns:cx8="http://schemas.microsoft.com/office/drawing/2016/5/14/chartex" xmlns:mc="http://schemas.openxmlformats.org/markup-compatibility/2006" xmlns:aink="http://schemas.microsoft.com/office/drawing/2016/ink" xmlns:am3d="http://schemas.microsoft.com/office/drawing/2017/model3d" xmlns:o="urn:schemas-microsoft-com:office:office" xmlns:r="http://schemas.openxmlformats.org/officeDocument/2006/relationships" xmlns:m="http://schemas.openxmlformats.org/officeDocument/2006/math" xmlns:v="urn:schemas-microsoft-com:vml" xmlns:wp14="http://schemas.microsoft.com/office/word/2010/wordprocessingDrawing" xmlns:wp="http://schemas.openxmlformats.org/drawingml/2006/wordprocessingDrawing" xmlns:w10="urn:schemas-microsoft-com:office:word" xmlns:w="http://schemas.openxmlformats.org/wordprocessingml/2006/main" xmlns:w14="http://schemas.microsoft.com/office/word/2010/wordml" xmlns:w15="http://schemas.microsoft.com/office/word/2012/wordml" xmlns:w16cex="http://schemas.microsoft.com/office/word/2018/wordml/cex" xmlns:w16cid="http://schemas.microsoft.com/office/word/2016/wordml/cid" xmlns:w16="http://schemas.microsoft.com/office/word/2018/wordml" xmlns:w16sdtdh="http://schemas.microsoft.com/office/word/2020/wordml/sdtdatahash" xmlns:w16se="http://schemas.microsoft.com/office/word/2015/wordml/symex" xmlns:wpg="http://schemas.microsoft.com/office/word/2010/wordprocessingGroup" xmlns:wpi="http://schemas.microsoft.com/office/word/2010/wordprocessingInk" xmlns:wne="http://schemas.microsoft.com/office/word/2006/wordml" xmlns:wps="http://schemas.microsoft.com/office/word/2010/wordprocessingShape" mc:Ignorable="w14 w15 w16se w16cid w16 w16cex w16sdtdh wp14">
+<w:numbering xmlns:wpc="http://schemas.microsoft.com/office/word/2010/wordprocessingCanvas" xmlns:cx="http://schemas.microsoft.com/office/drawing/2014/chartex" xmlns:cx1="http://schemas.microsoft.com/office/drawing/2015/9/8/chartex" xmlns:cx2="http://schemas.microsoft.com/office/drawing/2015/10/21/chartex" xmlns:cx3="http://schemas.microsoft.com/office/drawing/2016/5/9/chartex" xmlns:cx4="http://schemas.microsoft.com/office/drawing/2016/5/10/chartex" xmlns:cx5="http://schemas.microsoft.com/office/drawing/2016/5/11/chartex" xmlns:cx6="http://schemas.microsoft.com/office/drawing/2016/5/12/chartex" xmlns:cx7="http://schemas.microsoft.com/office/drawing/2016/5/13/chartex" xmlns:cx8="http://schemas.microsoft.com/office/drawing/2016/5/14/chartex" xmlns:mc="http://schemas.openxmlformats.org/markup-compatibility/2006" xmlns:aink="http://schemas.microsoft.com/office/drawing/2016/ink" xmlns:am3d="http://schemas.microsoft.com/office/drawing/2017/model3d" xmlns:o="urn:schemas-microsoft-com:office:office" xmlns:r="http://schemas.openxmlformats.org/officeDocument/2006/relationships" xmlns:m="http://schemas.openxmlformats.org/officeDocument/2006/math" xmlns:v="urn:schemas-microsoft-com:vml" xmlns:wp14="http://schemas.microsoft.com/office/word/2010/wordprocessingDrawing" xmlns:wp="http://schemas.openxmlformats.org/drawingml/2006/wordprocessingDrawing" xmlns:w10="urn:schemas-microsoft-com:office:word" xmlns:w="http://schemas.openxmlformats.org/wordprocessingml/2006/main" xmlns:w14="http://schemas.microsoft.com/office/word/2010/wordml" xmlns:w15="http://schemas.microsoft.com/office/word/2012/wordml" xmlns:w16cex="http://schemas.microsoft.com/office/word/2018/wordml/cex" xmlns:w16cid="http://schemas.microsoft.com/office/word/2016/wordml/cid" xmlns:w16="http://schemas.microsoft.com/office/word/2018/wordml" xmlns:w16se="http://schemas.microsoft.com/office/word/2015/wordml/symex" xmlns:wpg="http://schemas.microsoft.com/office/word/2010/wordprocessingGroup" xmlns:wpi="http://schemas.microsoft.com/office/word/2010/wordprocessingInk" xmlns:wne="http://schemas.microsoft.com/office/word/2006/wordml" xmlns:wps="http://schemas.microsoft.com/office/word/2010/wordprocessingShape" mc:Ignorable="w14 w15 w16se w16cid w16 w16cex wp14">
   <w:abstractNum w:abstractNumId="0" w15:restartNumberingAfterBreak="0">
     <w:nsid w:val="92FFF340"/>
     <w:multiLevelType w:val="multilevel"/>
@@ -6665,7 +6526,7 @@
 </file>
 
 <file path=word/styles.xml><?xml version="1.0" encoding="utf-8"?>
-<w:styles xmlns:mc="http://schemas.openxmlformats.org/markup-compatibility/2006" xmlns:r="http://schemas.openxmlformats.org/officeDocument/2006/relationships" xmlns:w="http://schemas.openxmlformats.org/wordprocessingml/2006/main" xmlns:w14="http://schemas.microsoft.com/office/word/2010/wordml" xmlns:w15="http://schemas.microsoft.com/office/word/2012/wordml" xmlns:w16cex="http://schemas.microsoft.com/office/word/2018/wordml/cex" xmlns:w16cid="http://schemas.microsoft.com/office/word/2016/wordml/cid" xmlns:w16="http://schemas.microsoft.com/office/word/2018/wordml" xmlns:w16sdtdh="http://schemas.microsoft.com/office/word/2020/wordml/sdtdatahash" xmlns:w16se="http://schemas.microsoft.com/office/word/2015/wordml/symex" mc:Ignorable="w14 w15 w16se w16cid w16 w16cex w16sdtdh">
+<w:styles xmlns:mc="http://schemas.openxmlformats.org/markup-compatibility/2006" xmlns:r="http://schemas.openxmlformats.org/officeDocument/2006/relationships" xmlns:w="http://schemas.openxmlformats.org/wordprocessingml/2006/main" xmlns:w14="http://schemas.microsoft.com/office/word/2010/wordml" xmlns:w15="http://schemas.microsoft.com/office/word/2012/wordml" xmlns:w16cex="http://schemas.microsoft.com/office/word/2018/wordml/cex" xmlns:w16cid="http://schemas.microsoft.com/office/word/2016/wordml/cid" xmlns:w16="http://schemas.microsoft.com/office/word/2018/wordml" xmlns:w16se="http://schemas.microsoft.com/office/word/2015/wordml/symex" mc:Ignorable="w14 w15 w16se w16cid w16 w16cex">
   <w:docDefaults>
     <w:rPrDefault>
       <w:rPr>

</xml_diff>